<commit_message>
docs: expresa todas las cifras en bolivianos y dólares a Bs 10,00
Unifica el tipo de cambio del documento en Bs 10,00 por dólar, con una
nota que explica el supuesto frente al oficial del BCB (Bs 9,83) y al
paralelo (Bs 10,9 a 11,9). Recalcula TAM, SAM, proyección de ingresos,
costos fijos, asignación del capital semilla, total de costos y ambos
puntos de equilibrio para que el documento quede internamente
consistente en una sola moneda de referencia.

Co-Authored-By: Claude Opus 5 <noreply@anthropic.com>
</commit_message>
<xml_diff>
--- a/docs/YAIS-RED_Modelo-de-Negocio_HACKBIZ2026.docx
+++ b/docs/YAIS-RED_Modelo-de-Negocio_HACKBIZ2026.docx
@@ -357,7 +357,7 @@
           <w:sz w:val="24"/>
           <w:szCs w:val="24"/>
         </w:rPr>
-        <w:t xml:space="preserve">El modelo de ingresos combina licencia mensual por aula en colegios privados (US$ 9,99), contratos de beca con organizaciones no gubernamentales que financian el acceso de escuelas fiscales, capacitación e implementación, patrocinio empresarial y subvenciones destinadas exclusivamente a desarrollo y evaluación. El equipo fundador aporta su trabajo sin sueldo durante el primer año, de modo que el capital semilla de Bs 12.000 se destina íntegramente a herramientas, constitución legal básica y activación comercial.</w:t>
+        <w:t xml:space="preserve">El modelo de ingresos combina licencia mensual por aula en colegios privados (US$ 9,99, equivalente a Bs 99,90), contratos de beca con organizaciones no gubernamentales que financian el acceso de escuelas fiscales, capacitación e implementación, patrocinio empresarial y subvenciones destinadas exclusivamente a desarrollo y evaluación. El equipo fundador aporta su trabajo sin sueldo durante el primer año, de modo que el capital semilla de Bs 12.000 (US$ 1.200) se destina íntegramente a herramientas, constitución legal básica y activación comercial.</w:t>
       </w:r>
     </w:p>
     <w:p>
@@ -376,7 +376,44 @@
           <w:sz w:val="24"/>
           <w:szCs w:val="24"/>
         </w:rPr>
-        <w:t xml:space="preserve">El punto de equilibrio operativo se alcanza con 35 aulas activas en el escenario de caja del primer año, y con 62 aulas cuando se valoriza la mano de obra a precio de mercado. La meta realista a doce meses (SOM) es de 80 aulas activas, lo que sitúa al proyecto por encima de su punto de equilibrio económico pleno al cierre del primer año.</w:t>
+        <w:t xml:space="preserve">El punto de equilibrio operativo se alcanza con 34 aulas activas en el escenario de caja del primer año, y con 61 aulas cuando se valoriza la mano de obra a precio de mercado. La meta realista a doce meses (SOM) es de 80 aulas activas, lo que sitúa al proyecto por encima de su punto de equilibrio económico pleno al cierre del primer año.</w:t>
+      </w:r>
+    </w:p>
+    <w:p>
+      <w:pPr>
+        <w:spacing w:after="120" w:before="200" w:line="360"/>
+        <w:jc w:val="left"/>
+      </w:pPr>
+      <w:r>
+        <w:rPr>
+          <w:rFonts w:ascii="Times New Roman" w:cs="Times New Roman" w:eastAsia="Times New Roman" w:hAnsi="Times New Roman"/>
+          <w:b/>
+          <w:bCs/>
+          <w:i w:val="false"/>
+          <w:iCs w:val="false"/>
+          <w:sz w:val="24"/>
+          <w:szCs w:val="24"/>
+        </w:rPr>
+        <w:t xml:space="preserve">Nota sobre el tipo de cambio</w:t>
+      </w:r>
+    </w:p>
+    <w:p>
+      <w:pPr>
+        <w:spacing w:after="120" w:before="0" w:line="360"/>
+        <w:ind w:firstLine="720"/>
+        <w:jc w:val="left"/>
+      </w:pPr>
+      <w:r>
+        <w:rPr>
+          <w:rFonts w:ascii="Times New Roman" w:cs="Times New Roman" w:eastAsia="Times New Roman" w:hAnsi="Times New Roman"/>
+          <w:b w:val="false"/>
+          <w:bCs w:val="false"/>
+          <w:i w:val="false"/>
+          <w:iCs w:val="false"/>
+          <w:sz w:val="24"/>
+          <w:szCs w:val="24"/>
+        </w:rPr>
+        <w:t xml:space="preserve">Todas las cifras de este documento se expresan en bolivianos y en dólares estadounidenses, con un tipo de cambio referencial de Bs 10,00 por dólar. El tipo de cambio oficial del Banco Central de Bolivia era de Bs 9,83 por dólar al 17 de septiembre de 2026, mientras que el mercado paralelo operaba entre Bs 10,9 y Bs 11,9 en la misma semana. Se adopta Bs 10,00 por dos razones: facilita la lectura y la comparación rápida, y constituye un supuesto conservador, ya que un pago efectivo en dólares desde Bolivia cuesta en la práctica más que la conversión oficial.</w:t>
       </w:r>
     </w:p>
     <w:p>
@@ -2595,7 +2632,7 @@
                 <w:sz w:val="20"/>
                 <w:szCs w:val="20"/>
               </w:rPr>
-              <w:t xml:space="preserve">Total TAM (valor anual)</w:t>
+              <w:t xml:space="preserve">Total TAM (valor anual, Bs)</w:t>
             </w:r>
           </w:p>
         </w:tc>
@@ -2623,7 +2660,7 @@
                 <w:sz w:val="20"/>
                 <w:szCs w:val="20"/>
               </w:rPr>
-              <w:t xml:space="preserve">52.800 aulas × Bs 98,20 × 12 meses</w:t>
+              <w:t xml:space="preserve">52.800 aulas × Bs 99,90 × 12 meses</w:t>
             </w:r>
           </w:p>
         </w:tc>
@@ -2651,7 +2688,7 @@
                 <w:sz w:val="20"/>
                 <w:szCs w:val="20"/>
               </w:rPr>
-              <w:t xml:space="preserve">Bs 62.219.520</w:t>
+              <w:t xml:space="preserve">Bs 63.296.640</w:t>
             </w:r>
           </w:p>
         </w:tc>
@@ -2681,7 +2718,7 @@
                 <w:sz w:val="20"/>
                 <w:szCs w:val="20"/>
               </w:rPr>
-              <w:t xml:space="preserve">Equivalente en dólares</w:t>
+              <w:t xml:space="preserve">Total TAM (valor anual, US$)</w:t>
             </w:r>
           </w:p>
         </w:tc>
@@ -2709,7 +2746,7 @@
                 <w:sz w:val="20"/>
                 <w:szCs w:val="20"/>
               </w:rPr>
-              <w:t xml:space="preserve">Tipo de cambio Bs 9,83 por USD (BCB, 17-09-2026)</w:t>
+              <w:t xml:space="preserve">Tipo de cambio referencial Bs 10,00 por dólar</w:t>
             </w:r>
           </w:p>
         </w:tc>
@@ -2737,7 +2774,7 @@
                 <w:sz w:val="20"/>
                 <w:szCs w:val="20"/>
               </w:rPr>
-              <w:t xml:space="preserve">US$ 6.329.554</w:t>
+              <w:t xml:space="preserve">US$ 6.329.664</w:t>
             </w:r>
           </w:p>
         </w:tc>
@@ -2756,7 +2793,7 @@
           <w:sz w:val="18"/>
           <w:szCs w:val="18"/>
         </w:rPr>
-        <w:t xml:space="preserve">Tabla 3. Mercado total direccionable. El precio de referencia es US$ 9,99 por aula al mes.</w:t>
+        <w:t xml:space="preserve">Tabla 3. Mercado total direccionable. El precio de referencia es US$ 9,99 (Bs 99,90) por aula al mes.</w:t>
       </w:r>
     </w:p>
     <w:p>
@@ -3495,7 +3532,7 @@
                 <w:sz w:val="20"/>
                 <w:szCs w:val="20"/>
               </w:rPr>
-              <w:t xml:space="preserve">Total SAM (valor anual)</w:t>
+              <w:t xml:space="preserve">Total SAM (valor anual, Bs)</w:t>
             </w:r>
           </w:p>
         </w:tc>
@@ -3523,7 +3560,7 @@
                 <w:sz w:val="20"/>
                 <w:szCs w:val="20"/>
               </w:rPr>
-              <w:t xml:space="preserve">7.500 aulas × Bs 98,20 × 12 meses</w:t>
+              <w:t xml:space="preserve">7.500 aulas × Bs 99,90 × 12 meses</w:t>
             </w:r>
           </w:p>
         </w:tc>
@@ -3551,7 +3588,7 @@
                 <w:sz w:val="20"/>
                 <w:szCs w:val="20"/>
               </w:rPr>
-              <w:t xml:space="preserve">Bs 8.838.000</w:t>
+              <w:t xml:space="preserve">Bs 8.991.000</w:t>
             </w:r>
           </w:p>
         </w:tc>
@@ -3581,7 +3618,7 @@
                 <w:sz w:val="20"/>
                 <w:szCs w:val="20"/>
               </w:rPr>
-              <w:t xml:space="preserve">Equivalente en dólares</w:t>
+              <w:t xml:space="preserve">Total SAM (valor anual, US$)</w:t>
             </w:r>
           </w:p>
         </w:tc>
@@ -3609,7 +3646,7 @@
                 <w:sz w:val="20"/>
                 <w:szCs w:val="20"/>
               </w:rPr>
-              <w:t xml:space="preserve">Tipo de cambio Bs 9,83 por USD</w:t>
+              <w:t xml:space="preserve">Tipo de cambio referencial Bs 10,00 por dólar</w:t>
             </w:r>
           </w:p>
         </w:tc>
@@ -3637,7 +3674,7 @@
                 <w:sz w:val="20"/>
                 <w:szCs w:val="20"/>
               </w:rPr>
-              <w:t xml:space="preserve">US$ 899.085</w:t>
+              <w:t xml:space="preserve">US$ 899.100</w:t>
             </w:r>
           </w:p>
         </w:tc>
@@ -3837,7 +3874,7 @@
                 <w:sz w:val="20"/>
                 <w:szCs w:val="20"/>
               </w:rPr>
-              <w:t xml:space="preserve">Venta relacional de cuatro fundadores a tiempo parcial, con Bs 6.940 de activación en los primeros tres meses</w:t>
+              <w:t xml:space="preserve">Venta relacional de cuatro fundadores a tiempo parcial, con Bs 6.960 (US$ 696) de activación en los primeros tres meses</w:t>
             </w:r>
           </w:p>
         </w:tc>
@@ -4252,10 +4289,11 @@
         </w:tblBorders>
       </w:tblPr>
       <w:tblGrid>
-        <w:gridCol w:w="3120"/>
-        <w:gridCol w:w="2080"/>
-        <w:gridCol w:w="2080"/>
-        <w:gridCol w:w="2080"/>
+        <w:gridCol w:w="2600"/>
+        <w:gridCol w:w="1560"/>
+        <w:gridCol w:w="1700"/>
+        <w:gridCol w:w="1750"/>
+        <w:gridCol w:w="1750"/>
       </w:tblGrid>
       <w:tr>
         <w:trPr>
@@ -4263,7 +4301,7 @@
         </w:trPr>
         <w:tc>
           <w:tcPr>
-            <w:tcW w:type="dxa" w:w="3120"/>
+            <w:tcW w:type="dxa" w:w="2600"/>
             <w:shd w:fill="1F3864" w:color="auto" w:val="clear"/>
             <w:tcMar>
               <w:top w:type="dxa" w:w="60"/>
@@ -4292,7 +4330,7 @@
         </w:tc>
         <w:tc>
           <w:tcPr>
-            <w:tcW w:type="dxa" w:w="2080"/>
+            <w:tcW w:type="dxa" w:w="1560"/>
             <w:shd w:fill="1F3864" w:color="auto" w:val="clear"/>
             <w:tcMar>
               <w:top w:type="dxa" w:w="60"/>
@@ -4321,7 +4359,7 @@
         </w:tc>
         <w:tc>
           <w:tcPr>
-            <w:tcW w:type="dxa" w:w="2080"/>
+            <w:tcW w:type="dxa" w:w="1700"/>
             <w:shd w:fill="1F3864" w:color="auto" w:val="clear"/>
             <w:tcMar>
               <w:top w:type="dxa" w:w="60"/>
@@ -4344,13 +4382,13 @@
                 <w:sz w:val="20"/>
                 <w:szCs w:val="20"/>
               </w:rPr>
-              <w:t xml:space="preserve">Ingreso mensual (Bs)</w:t>
-            </w:r>
-          </w:p>
-        </w:tc>
-        <w:tc>
-          <w:tcPr>
-            <w:tcW w:type="dxa" w:w="2080"/>
+              <w:t xml:space="preserve">Mensual (Bs)</w:t>
+            </w:r>
+          </w:p>
+        </w:tc>
+        <w:tc>
+          <w:tcPr>
+            <w:tcW w:type="dxa" w:w="1750"/>
             <w:shd w:fill="1F3864" w:color="auto" w:val="clear"/>
             <w:tcMar>
               <w:top w:type="dxa" w:w="60"/>
@@ -4373,7 +4411,36 @@
                 <w:sz w:val="20"/>
                 <w:szCs w:val="20"/>
               </w:rPr>
-              <w:t xml:space="preserve">Ingreso anual (Bs)</w:t>
+              <w:t xml:space="preserve">Anual (Bs)</w:t>
+            </w:r>
+          </w:p>
+        </w:tc>
+        <w:tc>
+          <w:tcPr>
+            <w:tcW w:type="dxa" w:w="1750"/>
+            <w:shd w:fill="1F3864" w:color="auto" w:val="clear"/>
+            <w:tcMar>
+              <w:top w:type="dxa" w:w="60"/>
+              <w:left w:type="dxa" w:w="90"/>
+              <w:bottom w:type="dxa" w:w="60"/>
+              <w:right w:type="dxa" w:w="90"/>
+            </w:tcMar>
+          </w:tcPr>
+          <w:p>
+            <w:pPr>
+              <w:spacing w:after="0" w:line="240"/>
+              <w:jc w:val="center"/>
+            </w:pPr>
+            <w:r>
+              <w:rPr>
+                <w:rFonts w:ascii="Times New Roman" w:cs="Times New Roman" w:eastAsia="Times New Roman" w:hAnsi="Times New Roman"/>
+                <w:b/>
+                <w:bCs/>
+                <w:color w:val="FFFFFF"/>
+                <w:sz w:val="20"/>
+                <w:szCs w:val="20"/>
+              </w:rPr>
+              <w:t xml:space="preserve">Anual (US$)</w:t>
             </w:r>
           </w:p>
         </w:tc>
@@ -4381,7 +4448,7 @@
       <w:tr>
         <w:tc>
           <w:tcPr>
-            <w:tcW w:type="dxa" w:w="3120"/>
+            <w:tcW w:type="dxa" w:w="2600"/>
             <w:tcMar>
               <w:top w:type="dxa" w:w="60"/>
               <w:left w:type="dxa" w:w="90"/>
@@ -4408,7 +4475,7 @@
         </w:tc>
         <w:tc>
           <w:tcPr>
-            <w:tcW w:type="dxa" w:w="2080"/>
+            <w:tcW w:type="dxa" w:w="1560"/>
             <w:tcMar>
               <w:top w:type="dxa" w:w="60"/>
               <w:left w:type="dxa" w:w="90"/>
@@ -4435,55 +4502,82 @@
         </w:tc>
         <w:tc>
           <w:tcPr>
-            <w:tcW w:type="dxa" w:w="2080"/>
-            <w:tcMar>
-              <w:top w:type="dxa" w:w="60"/>
-              <w:left w:type="dxa" w:w="90"/>
-              <w:bottom w:type="dxa" w:w="60"/>
-              <w:right w:type="dxa" w:w="90"/>
-            </w:tcMar>
-          </w:tcPr>
-          <w:p>
-            <w:pPr>
-              <w:spacing w:after="0" w:line="240"/>
-              <w:jc w:val="right"/>
-            </w:pPr>
-            <w:r>
-              <w:rPr>
-                <w:rFonts w:ascii="Times New Roman" w:cs="Times New Roman" w:eastAsia="Times New Roman" w:hAnsi="Times New Roman"/>
-                <w:b w:val="false"/>
-                <w:bCs w:val="false"/>
-                <w:sz w:val="20"/>
-                <w:szCs w:val="20"/>
-              </w:rPr>
-              <w:t xml:space="preserve">2.455</w:t>
-            </w:r>
-          </w:p>
-        </w:tc>
-        <w:tc>
-          <w:tcPr>
-            <w:tcW w:type="dxa" w:w="2080"/>
-            <w:tcMar>
-              <w:top w:type="dxa" w:w="60"/>
-              <w:left w:type="dxa" w:w="90"/>
-              <w:bottom w:type="dxa" w:w="60"/>
-              <w:right w:type="dxa" w:w="90"/>
-            </w:tcMar>
-          </w:tcPr>
-          <w:p>
-            <w:pPr>
-              <w:spacing w:after="0" w:line="240"/>
-              <w:jc w:val="right"/>
-            </w:pPr>
-            <w:r>
-              <w:rPr>
-                <w:rFonts w:ascii="Times New Roman" w:cs="Times New Roman" w:eastAsia="Times New Roman" w:hAnsi="Times New Roman"/>
-                <w:b w:val="false"/>
-                <w:bCs w:val="false"/>
-                <w:sz w:val="20"/>
-                <w:szCs w:val="20"/>
-              </w:rPr>
-              <w:t xml:space="preserve">29.460</w:t>
+            <w:tcW w:type="dxa" w:w="1700"/>
+            <w:tcMar>
+              <w:top w:type="dxa" w:w="60"/>
+              <w:left w:type="dxa" w:w="90"/>
+              <w:bottom w:type="dxa" w:w="60"/>
+              <w:right w:type="dxa" w:w="90"/>
+            </w:tcMar>
+          </w:tcPr>
+          <w:p>
+            <w:pPr>
+              <w:spacing w:after="0" w:line="240"/>
+              <w:jc w:val="right"/>
+            </w:pPr>
+            <w:r>
+              <w:rPr>
+                <w:rFonts w:ascii="Times New Roman" w:cs="Times New Roman" w:eastAsia="Times New Roman" w:hAnsi="Times New Roman"/>
+                <w:b w:val="false"/>
+                <w:bCs w:val="false"/>
+                <w:sz w:val="20"/>
+                <w:szCs w:val="20"/>
+              </w:rPr>
+              <w:t xml:space="preserve">2.497,50</w:t>
+            </w:r>
+          </w:p>
+        </w:tc>
+        <w:tc>
+          <w:tcPr>
+            <w:tcW w:type="dxa" w:w="1750"/>
+            <w:tcMar>
+              <w:top w:type="dxa" w:w="60"/>
+              <w:left w:type="dxa" w:w="90"/>
+              <w:bottom w:type="dxa" w:w="60"/>
+              <w:right w:type="dxa" w:w="90"/>
+            </w:tcMar>
+          </w:tcPr>
+          <w:p>
+            <w:pPr>
+              <w:spacing w:after="0" w:line="240"/>
+              <w:jc w:val="right"/>
+            </w:pPr>
+            <w:r>
+              <w:rPr>
+                <w:rFonts w:ascii="Times New Roman" w:cs="Times New Roman" w:eastAsia="Times New Roman" w:hAnsi="Times New Roman"/>
+                <w:b w:val="false"/>
+                <w:bCs w:val="false"/>
+                <w:sz w:val="20"/>
+                <w:szCs w:val="20"/>
+              </w:rPr>
+              <w:t xml:space="preserve">29.970</w:t>
+            </w:r>
+          </w:p>
+        </w:tc>
+        <w:tc>
+          <w:tcPr>
+            <w:tcW w:type="dxa" w:w="1750"/>
+            <w:tcMar>
+              <w:top w:type="dxa" w:w="60"/>
+              <w:left w:type="dxa" w:w="90"/>
+              <w:bottom w:type="dxa" w:w="60"/>
+              <w:right w:type="dxa" w:w="90"/>
+            </w:tcMar>
+          </w:tcPr>
+          <w:p>
+            <w:pPr>
+              <w:spacing w:after="0" w:line="240"/>
+              <w:jc w:val="right"/>
+            </w:pPr>
+            <w:r>
+              <w:rPr>
+                <w:rFonts w:ascii="Times New Roman" w:cs="Times New Roman" w:eastAsia="Times New Roman" w:hAnsi="Times New Roman"/>
+                <w:b w:val="false"/>
+                <w:bCs w:val="false"/>
+                <w:sz w:val="20"/>
+                <w:szCs w:val="20"/>
+              </w:rPr>
+              <w:t xml:space="preserve">2.997</w:t>
             </w:r>
           </w:p>
         </w:tc>
@@ -4491,7 +4585,7 @@
       <w:tr>
         <w:tc>
           <w:tcPr>
-            <w:tcW w:type="dxa" w:w="3120"/>
+            <w:tcW w:type="dxa" w:w="2600"/>
             <w:tcMar>
               <w:top w:type="dxa" w:w="60"/>
               <w:left w:type="dxa" w:w="90"/>
@@ -4518,7 +4612,7 @@
         </w:tc>
         <w:tc>
           <w:tcPr>
-            <w:tcW w:type="dxa" w:w="2080"/>
+            <w:tcW w:type="dxa" w:w="1560"/>
             <w:tcMar>
               <w:top w:type="dxa" w:w="60"/>
               <w:left w:type="dxa" w:w="90"/>
@@ -4545,55 +4639,82 @@
         </w:tc>
         <w:tc>
           <w:tcPr>
-            <w:tcW w:type="dxa" w:w="2080"/>
-            <w:tcMar>
-              <w:top w:type="dxa" w:w="60"/>
-              <w:left w:type="dxa" w:w="90"/>
-              <w:bottom w:type="dxa" w:w="60"/>
-              <w:right w:type="dxa" w:w="90"/>
-            </w:tcMar>
-          </w:tcPr>
-          <w:p>
-            <w:pPr>
-              <w:spacing w:after="0" w:line="240"/>
-              <w:jc w:val="right"/>
-            </w:pPr>
-            <w:r>
-              <w:rPr>
-                <w:rFonts w:ascii="Times New Roman" w:cs="Times New Roman" w:eastAsia="Times New Roman" w:hAnsi="Times New Roman"/>
-                <w:b w:val="false"/>
-                <w:bCs w:val="false"/>
-                <w:sz w:val="20"/>
-                <w:szCs w:val="20"/>
-              </w:rPr>
-              <w:t xml:space="preserve">5.401</w:t>
-            </w:r>
-          </w:p>
-        </w:tc>
-        <w:tc>
-          <w:tcPr>
-            <w:tcW w:type="dxa" w:w="2080"/>
-            <w:tcMar>
-              <w:top w:type="dxa" w:w="60"/>
-              <w:left w:type="dxa" w:w="90"/>
-              <w:bottom w:type="dxa" w:w="60"/>
-              <w:right w:type="dxa" w:w="90"/>
-            </w:tcMar>
-          </w:tcPr>
-          <w:p>
-            <w:pPr>
-              <w:spacing w:after="0" w:line="240"/>
-              <w:jc w:val="right"/>
-            </w:pPr>
-            <w:r>
-              <w:rPr>
-                <w:rFonts w:ascii="Times New Roman" w:cs="Times New Roman" w:eastAsia="Times New Roman" w:hAnsi="Times New Roman"/>
-                <w:b w:val="false"/>
-                <w:bCs w:val="false"/>
-                <w:sz w:val="20"/>
-                <w:szCs w:val="20"/>
-              </w:rPr>
-              <w:t xml:space="preserve">64.812</w:t>
+            <w:tcW w:type="dxa" w:w="1700"/>
+            <w:tcMar>
+              <w:top w:type="dxa" w:w="60"/>
+              <w:left w:type="dxa" w:w="90"/>
+              <w:bottom w:type="dxa" w:w="60"/>
+              <w:right w:type="dxa" w:w="90"/>
+            </w:tcMar>
+          </w:tcPr>
+          <w:p>
+            <w:pPr>
+              <w:spacing w:after="0" w:line="240"/>
+              <w:jc w:val="right"/>
+            </w:pPr>
+            <w:r>
+              <w:rPr>
+                <w:rFonts w:ascii="Times New Roman" w:cs="Times New Roman" w:eastAsia="Times New Roman" w:hAnsi="Times New Roman"/>
+                <w:b w:val="false"/>
+                <w:bCs w:val="false"/>
+                <w:sz w:val="20"/>
+                <w:szCs w:val="20"/>
+              </w:rPr>
+              <w:t xml:space="preserve">5.494,50</w:t>
+            </w:r>
+          </w:p>
+        </w:tc>
+        <w:tc>
+          <w:tcPr>
+            <w:tcW w:type="dxa" w:w="1750"/>
+            <w:tcMar>
+              <w:top w:type="dxa" w:w="60"/>
+              <w:left w:type="dxa" w:w="90"/>
+              <w:bottom w:type="dxa" w:w="60"/>
+              <w:right w:type="dxa" w:w="90"/>
+            </w:tcMar>
+          </w:tcPr>
+          <w:p>
+            <w:pPr>
+              <w:spacing w:after="0" w:line="240"/>
+              <w:jc w:val="right"/>
+            </w:pPr>
+            <w:r>
+              <w:rPr>
+                <w:rFonts w:ascii="Times New Roman" w:cs="Times New Roman" w:eastAsia="Times New Roman" w:hAnsi="Times New Roman"/>
+                <w:b w:val="false"/>
+                <w:bCs w:val="false"/>
+                <w:sz w:val="20"/>
+                <w:szCs w:val="20"/>
+              </w:rPr>
+              <w:t xml:space="preserve">65.934</w:t>
+            </w:r>
+          </w:p>
+        </w:tc>
+        <w:tc>
+          <w:tcPr>
+            <w:tcW w:type="dxa" w:w="1750"/>
+            <w:tcMar>
+              <w:top w:type="dxa" w:w="60"/>
+              <w:left w:type="dxa" w:w="90"/>
+              <w:bottom w:type="dxa" w:w="60"/>
+              <w:right w:type="dxa" w:w="90"/>
+            </w:tcMar>
+          </w:tcPr>
+          <w:p>
+            <w:pPr>
+              <w:spacing w:after="0" w:line="240"/>
+              <w:jc w:val="right"/>
+            </w:pPr>
+            <w:r>
+              <w:rPr>
+                <w:rFonts w:ascii="Times New Roman" w:cs="Times New Roman" w:eastAsia="Times New Roman" w:hAnsi="Times New Roman"/>
+                <w:b w:val="false"/>
+                <w:bCs w:val="false"/>
+                <w:sz w:val="20"/>
+                <w:szCs w:val="20"/>
+              </w:rPr>
+              <w:t xml:space="preserve">6.593</w:t>
             </w:r>
           </w:p>
         </w:tc>
@@ -4601,7 +4722,7 @@
       <w:tr>
         <w:tc>
           <w:tcPr>
-            <w:tcW w:type="dxa" w:w="3120"/>
+            <w:tcW w:type="dxa" w:w="2600"/>
             <w:tcMar>
               <w:top w:type="dxa" w:w="60"/>
               <w:left w:type="dxa" w:w="90"/>
@@ -4628,7 +4749,7 @@
         </w:tc>
         <w:tc>
           <w:tcPr>
-            <w:tcW w:type="dxa" w:w="2080"/>
+            <w:tcW w:type="dxa" w:w="1560"/>
             <w:tcMar>
               <w:top w:type="dxa" w:w="60"/>
               <w:left w:type="dxa" w:w="90"/>
@@ -4655,34 +4776,34 @@
         </w:tc>
         <w:tc>
           <w:tcPr>
-            <w:tcW w:type="dxa" w:w="2080"/>
-            <w:tcMar>
-              <w:top w:type="dxa" w:w="60"/>
-              <w:left w:type="dxa" w:w="90"/>
-              <w:bottom w:type="dxa" w:w="60"/>
-              <w:right w:type="dxa" w:w="90"/>
-            </w:tcMar>
-          </w:tcPr>
-          <w:p>
-            <w:pPr>
-              <w:spacing w:after="0" w:line="240"/>
-              <w:jc w:val="right"/>
-            </w:pPr>
-            <w:r>
-              <w:rPr>
-                <w:rFonts w:ascii="Times New Roman" w:cs="Times New Roman" w:eastAsia="Times New Roman" w:hAnsi="Times New Roman"/>
-                <w:b w:val="false"/>
-                <w:bCs w:val="false"/>
-                <w:sz w:val="20"/>
-                <w:szCs w:val="20"/>
-              </w:rPr>
-              <w:t xml:space="preserve">833</w:t>
-            </w:r>
-          </w:p>
-        </w:tc>
-        <w:tc>
-          <w:tcPr>
-            <w:tcW w:type="dxa" w:w="2080"/>
+            <w:tcW w:type="dxa" w:w="1700"/>
+            <w:tcMar>
+              <w:top w:type="dxa" w:w="60"/>
+              <w:left w:type="dxa" w:w="90"/>
+              <w:bottom w:type="dxa" w:w="60"/>
+              <w:right w:type="dxa" w:w="90"/>
+            </w:tcMar>
+          </w:tcPr>
+          <w:p>
+            <w:pPr>
+              <w:spacing w:after="0" w:line="240"/>
+              <w:jc w:val="right"/>
+            </w:pPr>
+            <w:r>
+              <w:rPr>
+                <w:rFonts w:ascii="Times New Roman" w:cs="Times New Roman" w:eastAsia="Times New Roman" w:hAnsi="Times New Roman"/>
+                <w:b w:val="false"/>
+                <w:bCs w:val="false"/>
+                <w:sz w:val="20"/>
+                <w:szCs w:val="20"/>
+              </w:rPr>
+              <w:t xml:space="preserve">833,33</w:t>
+            </w:r>
+          </w:p>
+        </w:tc>
+        <w:tc>
+          <w:tcPr>
+            <w:tcW w:type="dxa" w:w="1750"/>
             <w:tcMar>
               <w:top w:type="dxa" w:w="60"/>
               <w:left w:type="dxa" w:w="90"/>
@@ -4704,6 +4825,33 @@
                 <w:szCs w:val="20"/>
               </w:rPr>
               <w:t xml:space="preserve">10.000</w:t>
+            </w:r>
+          </w:p>
+        </w:tc>
+        <w:tc>
+          <w:tcPr>
+            <w:tcW w:type="dxa" w:w="1750"/>
+            <w:tcMar>
+              <w:top w:type="dxa" w:w="60"/>
+              <w:left w:type="dxa" w:w="90"/>
+              <w:bottom w:type="dxa" w:w="60"/>
+              <w:right w:type="dxa" w:w="90"/>
+            </w:tcMar>
+          </w:tcPr>
+          <w:p>
+            <w:pPr>
+              <w:spacing w:after="0" w:line="240"/>
+              <w:jc w:val="right"/>
+            </w:pPr>
+            <w:r>
+              <w:rPr>
+                <w:rFonts w:ascii="Times New Roman" w:cs="Times New Roman" w:eastAsia="Times New Roman" w:hAnsi="Times New Roman"/>
+                <w:b w:val="false"/>
+                <w:bCs w:val="false"/>
+                <w:sz w:val="20"/>
+                <w:szCs w:val="20"/>
+              </w:rPr>
+              <w:t xml:space="preserve">1.000</w:t>
             </w:r>
           </w:p>
         </w:tc>
@@ -4711,7 +4859,7 @@
       <w:tr>
         <w:tc>
           <w:tcPr>
-            <w:tcW w:type="dxa" w:w="3120"/>
+            <w:tcW w:type="dxa" w:w="2600"/>
             <w:shd w:fill="F4B183" w:color="auto" w:val="clear"/>
             <w:tcMar>
               <w:top w:type="dxa" w:w="60"/>
@@ -4739,7 +4887,7 @@
         </w:tc>
         <w:tc>
           <w:tcPr>
-            <w:tcW w:type="dxa" w:w="2080"/>
+            <w:tcW w:type="dxa" w:w="1560"/>
             <w:shd w:fill="F4B183" w:color="auto" w:val="clear"/>
             <w:tcMar>
               <w:top w:type="dxa" w:w="60"/>
@@ -4767,7 +4915,7 @@
         </w:tc>
         <w:tc>
           <w:tcPr>
-            <w:tcW w:type="dxa" w:w="2080"/>
+            <w:tcW w:type="dxa" w:w="1700"/>
             <w:shd w:fill="F4B183" w:color="auto" w:val="clear"/>
             <w:tcMar>
               <w:top w:type="dxa" w:w="60"/>
@@ -4789,13 +4937,13 @@
                 <w:sz w:val="20"/>
                 <w:szCs w:val="20"/>
               </w:rPr>
-              <w:t xml:space="preserve">8.689</w:t>
-            </w:r>
-          </w:p>
-        </w:tc>
-        <w:tc>
-          <w:tcPr>
-            <w:tcW w:type="dxa" w:w="2080"/>
+              <w:t xml:space="preserve">8.825,33</w:t>
+            </w:r>
+          </w:p>
+        </w:tc>
+        <w:tc>
+          <w:tcPr>
+            <w:tcW w:type="dxa" w:w="1750"/>
             <w:shd w:fill="F4B183" w:color="auto" w:val="clear"/>
             <w:tcMar>
               <w:top w:type="dxa" w:w="60"/>
@@ -4817,7 +4965,35 @@
                 <w:sz w:val="20"/>
                 <w:szCs w:val="20"/>
               </w:rPr>
-              <w:t xml:space="preserve">104.272</w:t>
+              <w:t xml:space="preserve">105.904</w:t>
+            </w:r>
+          </w:p>
+        </w:tc>
+        <w:tc>
+          <w:tcPr>
+            <w:tcW w:type="dxa" w:w="1750"/>
+            <w:shd w:fill="F4B183" w:color="auto" w:val="clear"/>
+            <w:tcMar>
+              <w:top w:type="dxa" w:w="60"/>
+              <w:left w:type="dxa" w:w="90"/>
+              <w:bottom w:type="dxa" w:w="60"/>
+              <w:right w:type="dxa" w:w="90"/>
+            </w:tcMar>
+          </w:tcPr>
+          <w:p>
+            <w:pPr>
+              <w:spacing w:after="0" w:line="240"/>
+              <w:jc w:val="right"/>
+            </w:pPr>
+            <w:r>
+              <w:rPr>
+                <w:rFonts w:ascii="Times New Roman" w:cs="Times New Roman" w:eastAsia="Times New Roman" w:hAnsi="Times New Roman"/>
+                <w:b/>
+                <w:bCs/>
+                <w:sz w:val="20"/>
+                <w:szCs w:val="20"/>
+              </w:rPr>
+              <w:t xml:space="preserve">10.590</w:t>
             </w:r>
           </w:p>
         </w:tc>
@@ -4825,7 +5001,7 @@
       <w:tr>
         <w:tc>
           <w:tcPr>
-            <w:tcW w:type="dxa" w:w="3120"/>
+            <w:tcW w:type="dxa" w:w="2600"/>
             <w:shd w:fill="D9E2F3" w:color="auto" w:val="clear"/>
             <w:tcMar>
               <w:top w:type="dxa" w:w="60"/>
@@ -4853,7 +5029,7 @@
         </w:tc>
         <w:tc>
           <w:tcPr>
-            <w:tcW w:type="dxa" w:w="2080"/>
+            <w:tcW w:type="dxa" w:w="1560"/>
             <w:shd w:fill="D9E2F3" w:color="auto" w:val="clear"/>
             <w:tcMar>
               <w:top w:type="dxa" w:w="60"/>
@@ -4875,13 +5051,13 @@
                 <w:sz w:val="20"/>
                 <w:szCs w:val="20"/>
               </w:rPr>
-              <w:t xml:space="preserve">40 aulas promedio</w:t>
-            </w:r>
-          </w:p>
-        </w:tc>
-        <w:tc>
-          <w:tcPr>
-            <w:tcW w:type="dxa" w:w="2080"/>
+              <w:t xml:space="preserve">40 aulas prom.</w:t>
+            </w:r>
+          </w:p>
+        </w:tc>
+        <w:tc>
+          <w:tcPr>
+            <w:tcW w:type="dxa" w:w="1700"/>
             <w:shd w:fill="D9E2F3" w:color="auto" w:val="clear"/>
             <w:tcMar>
               <w:top w:type="dxa" w:w="60"/>
@@ -4903,13 +5079,13 @@
                 <w:sz w:val="20"/>
                 <w:szCs w:val="20"/>
               </w:rPr>
-              <w:t xml:space="preserve">4.761</w:t>
-            </w:r>
-          </w:p>
-        </w:tc>
-        <w:tc>
-          <w:tcPr>
-            <w:tcW w:type="dxa" w:w="2080"/>
+              <w:t xml:space="preserve">4.829,33</w:t>
+            </w:r>
+          </w:p>
+        </w:tc>
+        <w:tc>
+          <w:tcPr>
+            <w:tcW w:type="dxa" w:w="1750"/>
             <w:shd w:fill="D9E2F3" w:color="auto" w:val="clear"/>
             <w:tcMar>
               <w:top w:type="dxa" w:w="60"/>
@@ -4931,7 +5107,35 @@
                 <w:sz w:val="20"/>
                 <w:szCs w:val="20"/>
               </w:rPr>
-              <w:t xml:space="preserve">57.136</w:t>
+              <w:t xml:space="preserve">57.952</w:t>
+            </w:r>
+          </w:p>
+        </w:tc>
+        <w:tc>
+          <w:tcPr>
+            <w:tcW w:type="dxa" w:w="1750"/>
+            <w:shd w:fill="D9E2F3" w:color="auto" w:val="clear"/>
+            <w:tcMar>
+              <w:top w:type="dxa" w:w="60"/>
+              <w:left w:type="dxa" w:w="90"/>
+              <w:bottom w:type="dxa" w:w="60"/>
+              <w:right w:type="dxa" w:w="90"/>
+            </w:tcMar>
+          </w:tcPr>
+          <w:p>
+            <w:pPr>
+              <w:spacing w:after="0" w:line="240"/>
+              <w:jc w:val="right"/>
+            </w:pPr>
+            <w:r>
+              <w:rPr>
+                <w:rFonts w:ascii="Times New Roman" w:cs="Times New Roman" w:eastAsia="Times New Roman" w:hAnsi="Times New Roman"/>
+                <w:b/>
+                <w:bCs/>
+                <w:sz w:val="20"/>
+                <w:szCs w:val="20"/>
+              </w:rPr>
+              <w:t xml:space="preserve">5.795</w:t>
             </w:r>
           </w:p>
         </w:tc>
@@ -7015,7 +7219,7 @@
           <w:sz w:val="24"/>
           <w:szCs w:val="24"/>
         </w:rPr>
-        <w:t xml:space="preserve">El canal está diseñado para minimizar tanto el costo como la huella ambiental. La capacitación es híbrida: la parte teórica se dicta en línea y la práctica se agrupa por sede reuniendo docentes de varios colegios, lo que reduce desplazamientos. El material para familias se envía en formato digital liviano a través del colegio y solo se imprime bajo demanda. El costo comercial se concentra en los Bs 6.940 de activación de los tres primeros meses, detallados en el Bloque IX.</w:t>
+        <w:t xml:space="preserve">El canal está diseñado para minimizar tanto el costo como la huella ambiental. La capacitación es híbrida: la parte teórica se dicta en línea y la práctica se agrupa por sede reuniendo docentes de varios colegios, lo que reduce desplazamientos. El material para familias se envía en formato digital liviano a través del colegio y solo se imprime bajo demanda. El costo comercial se concentra en los Bs 6.960 (US$ 696) de activación de los tres primeros meses, detallados en el Bloque IX.</w:t>
       </w:r>
     </w:p>
     <w:p>
@@ -7211,7 +7415,7 @@
           <w:sz w:val="24"/>
           <w:szCs w:val="24"/>
         </w:rPr>
-        <w:t xml:space="preserve">El costo de mantener la relación está incorporado en el costo variable por aula: Bs 13,33 mensuales de soporte y acompañamiento, y Bs 16,67 mensuales de supervisión psicológica prorrateada. En conjunto representan Bs 360 anuales por aula.</w:t>
+        <w:t xml:space="preserve">El costo de mantener la relación está incorporado en el costo variable por aula: Bs 13,33 mensuales de soporte y acompañamiento, y Bs 16,67 mensuales de supervisión psicológica prorrateada. En conjunto representan Bs 360 anuales por aula, equivalentes a US$ 36,00.</w:t>
       </w:r>
     </w:p>
     <w:p>
@@ -7440,7 +7644,7 @@
                 <w:sz w:val="20"/>
                 <w:szCs w:val="20"/>
               </w:rPr>
-              <w:t xml:space="preserve">US$ 9,99 por aula al mes</w:t>
+              <w:t xml:space="preserve">US$ 9,99 (Bs 99,90) por aula al mes</w:t>
             </w:r>
           </w:p>
         </w:tc>
@@ -7660,7 +7864,7 @@
                 <w:sz w:val="20"/>
                 <w:szCs w:val="20"/>
               </w:rPr>
-              <w:t xml:space="preserve">Bs 2.500 por taller de 4 horas</w:t>
+              <w:t xml:space="preserve">Bs 2.500 (US$ 250) por taller de 4 horas</w:t>
             </w:r>
           </w:p>
         </w:tc>
@@ -8330,7 +8534,7 @@
                 <w:sz w:val="20"/>
                 <w:szCs w:val="20"/>
               </w:rPr>
-              <w:t xml:space="preserve">Capital semilla de HACKBIZ por Bs 12.000 en efectivo.</w:t>
+              <w:t xml:space="preserve">Capital semilla de HACKBIZ por Bs 12.000 en efectivo (US$ 1.200).</w:t>
             </w:r>
           </w:p>
         </w:tc>
@@ -10558,7 +10762,7 @@
           <w:sz w:val="18"/>
           <w:szCs w:val="18"/>
         </w:rPr>
-        <w:t xml:space="preserve">Tabla 14. Costos variables por uso, expresados por aula y por mes.</w:t>
+        <w:t xml:space="preserve">Tabla 14. Costos variables por uso, expresados por aula y por mes. Total equivalente: US$ 0,31 mensuales, US$ 3,75 anuales por aula.</w:t>
       </w:r>
     </w:p>
     <w:p>
@@ -11454,7 +11658,7 @@
           <w:sz w:val="18"/>
           <w:szCs w:val="18"/>
         </w:rPr>
-        <w:t xml:space="preserve">Tabla 15. Mano de obra directa por aula y por mes, valorizada a precio de mercado.</w:t>
+        <w:t xml:space="preserve">Tabla 15. Mano de obra directa por aula y por mes, valorizada a precio de mercado. Total equivalente: US$ 4,25 mensuales, US$ 51,00 anuales por aula.</w:t>
       </w:r>
     </w:p>
     <w:p>
@@ -11507,11 +11711,12 @@
         </w:tblBorders>
       </w:tblPr>
       <w:tblGrid>
-        <w:gridCol w:w="3000"/>
-        <w:gridCol w:w="1400"/>
-        <w:gridCol w:w="1300"/>
-        <w:gridCol w:w="1660"/>
-        <w:gridCol w:w="2000"/>
+        <w:gridCol w:w="2800"/>
+        <w:gridCol w:w="1200"/>
+        <w:gridCol w:w="1100"/>
+        <w:gridCol w:w="1500"/>
+        <w:gridCol w:w="1500"/>
+        <w:gridCol w:w="1260"/>
       </w:tblGrid>
       <w:tr>
         <w:trPr>
@@ -11519,7 +11724,7 @@
         </w:trPr>
         <w:tc>
           <w:tcPr>
-            <w:tcW w:type="dxa" w:w="3000"/>
+            <w:tcW w:type="dxa" w:w="2800"/>
             <w:shd w:fill="C00000" w:color="auto" w:val="clear"/>
             <w:tcMar>
               <w:top w:type="dxa" w:w="60"/>
@@ -11548,7 +11753,7 @@
         </w:tc>
         <w:tc>
           <w:tcPr>
-            <w:tcW w:type="dxa" w:w="1400"/>
+            <w:tcW w:type="dxa" w:w="1200"/>
             <w:shd w:fill="C00000" w:color="auto" w:val="clear"/>
             <w:tcMar>
               <w:top w:type="dxa" w:w="60"/>
@@ -11577,7 +11782,7 @@
         </w:tc>
         <w:tc>
           <w:tcPr>
-            <w:tcW w:type="dxa" w:w="1300"/>
+            <w:tcW w:type="dxa" w:w="1100"/>
             <w:shd w:fill="C00000" w:color="auto" w:val="clear"/>
             <w:tcMar>
               <w:top w:type="dxa" w:w="60"/>
@@ -11600,13 +11805,13 @@
                 <w:sz w:val="20"/>
                 <w:szCs w:val="20"/>
               </w:rPr>
-              <w:t xml:space="preserve">Cantidad</w:t>
-            </w:r>
-          </w:p>
-        </w:tc>
-        <w:tc>
-          <w:tcPr>
-            <w:tcW w:type="dxa" w:w="1660"/>
+              <w:t xml:space="preserve">Cant.</w:t>
+            </w:r>
+          </w:p>
+        </w:tc>
+        <w:tc>
+          <w:tcPr>
+            <w:tcW w:type="dxa" w:w="1500"/>
             <w:shd w:fill="C00000" w:color="auto" w:val="clear"/>
             <w:tcMar>
               <w:top w:type="dxa" w:w="60"/>
@@ -11635,7 +11840,7 @@
         </w:tc>
         <w:tc>
           <w:tcPr>
-            <w:tcW w:type="dxa" w:w="2000"/>
+            <w:tcW w:type="dxa" w:w="1500"/>
             <w:shd w:fill="C00000" w:color="auto" w:val="clear"/>
             <w:tcMar>
               <w:top w:type="dxa" w:w="60"/>
@@ -11658,7 +11863,36 @@
                 <w:sz w:val="20"/>
                 <w:szCs w:val="20"/>
               </w:rPr>
-              <w:t xml:space="preserve">Costo mensual (Bs)</w:t>
+              <w:t xml:space="preserve">Mensual (Bs)</w:t>
+            </w:r>
+          </w:p>
+        </w:tc>
+        <w:tc>
+          <w:tcPr>
+            <w:tcW w:type="dxa" w:w="1260"/>
+            <w:shd w:fill="C00000" w:color="auto" w:val="clear"/>
+            <w:tcMar>
+              <w:top w:type="dxa" w:w="60"/>
+              <w:left w:type="dxa" w:w="90"/>
+              <w:bottom w:type="dxa" w:w="60"/>
+              <w:right w:type="dxa" w:w="90"/>
+            </w:tcMar>
+          </w:tcPr>
+          <w:p>
+            <w:pPr>
+              <w:spacing w:after="0" w:line="240"/>
+              <w:jc w:val="center"/>
+            </w:pPr>
+            <w:r>
+              <w:rPr>
+                <w:rFonts w:ascii="Times New Roman" w:cs="Times New Roman" w:eastAsia="Times New Roman" w:hAnsi="Times New Roman"/>
+                <w:b/>
+                <w:bCs/>
+                <w:color w:val="FFFFFF"/>
+                <w:sz w:val="20"/>
+                <w:szCs w:val="20"/>
+              </w:rPr>
+              <w:t xml:space="preserve">Mensual (US$)</w:t>
             </w:r>
           </w:p>
         </w:tc>
@@ -11666,7 +11900,7 @@
       <w:tr>
         <w:tc>
           <w:tcPr>
-            <w:tcW w:type="dxa" w:w="3000"/>
+            <w:tcW w:type="dxa" w:w="2800"/>
             <w:tcMar>
               <w:top w:type="dxa" w:w="60"/>
               <w:left w:type="dxa" w:w="90"/>
@@ -11693,7 +11927,7 @@
         </w:tc>
         <w:tc>
           <w:tcPr>
-            <w:tcW w:type="dxa" w:w="1400"/>
+            <w:tcW w:type="dxa" w:w="1200"/>
             <w:tcMar>
               <w:top w:type="dxa" w:w="60"/>
               <w:left w:type="dxa" w:w="90"/>
@@ -11720,7 +11954,7 @@
         </w:tc>
         <w:tc>
           <w:tcPr>
-            <w:tcW w:type="dxa" w:w="1300"/>
+            <w:tcW w:type="dxa" w:w="1100"/>
             <w:tcMar>
               <w:top w:type="dxa" w:w="60"/>
               <w:left w:type="dxa" w:w="90"/>
@@ -11747,55 +11981,82 @@
         </w:tc>
         <w:tc>
           <w:tcPr>
-            <w:tcW w:type="dxa" w:w="1660"/>
-            <w:tcMar>
-              <w:top w:type="dxa" w:w="60"/>
-              <w:left w:type="dxa" w:w="90"/>
-              <w:bottom w:type="dxa" w:w="60"/>
-              <w:right w:type="dxa" w:w="90"/>
-            </w:tcMar>
-          </w:tcPr>
-          <w:p>
-            <w:pPr>
-              <w:spacing w:after="0" w:line="240"/>
-              <w:jc w:val="right"/>
-            </w:pPr>
-            <w:r>
-              <w:rPr>
-                <w:rFonts w:ascii="Times New Roman" w:cs="Times New Roman" w:eastAsia="Times New Roman" w:hAnsi="Times New Roman"/>
-                <w:b w:val="false"/>
-                <w:bCs w:val="false"/>
-                <w:sz w:val="20"/>
-                <w:szCs w:val="20"/>
-              </w:rPr>
-              <w:t xml:space="preserve">820,00</w:t>
-            </w:r>
-          </w:p>
-        </w:tc>
-        <w:tc>
-          <w:tcPr>
-            <w:tcW w:type="dxa" w:w="2000"/>
-            <w:tcMar>
-              <w:top w:type="dxa" w:w="60"/>
-              <w:left w:type="dxa" w:w="90"/>
-              <w:bottom w:type="dxa" w:w="60"/>
-              <w:right w:type="dxa" w:w="90"/>
-            </w:tcMar>
-          </w:tcPr>
-          <w:p>
-            <w:pPr>
-              <w:spacing w:after="0" w:line="240"/>
-              <w:jc w:val="right"/>
-            </w:pPr>
-            <w:r>
-              <w:rPr>
-                <w:rFonts w:ascii="Times New Roman" w:cs="Times New Roman" w:eastAsia="Times New Roman" w:hAnsi="Times New Roman"/>
-                <w:b w:val="false"/>
-                <w:bCs w:val="false"/>
-                <w:sz w:val="20"/>
-                <w:szCs w:val="20"/>
-              </w:rPr>
-              <w:t xml:space="preserve">820,00</w:t>
+            <w:tcW w:type="dxa" w:w="1500"/>
+            <w:tcMar>
+              <w:top w:type="dxa" w:w="60"/>
+              <w:left w:type="dxa" w:w="90"/>
+              <w:bottom w:type="dxa" w:w="60"/>
+              <w:right w:type="dxa" w:w="90"/>
+            </w:tcMar>
+          </w:tcPr>
+          <w:p>
+            <w:pPr>
+              <w:spacing w:after="0" w:line="240"/>
+              <w:jc w:val="right"/>
+            </w:pPr>
+            <w:r>
+              <w:rPr>
+                <w:rFonts w:ascii="Times New Roman" w:cs="Times New Roman" w:eastAsia="Times New Roman" w:hAnsi="Times New Roman"/>
+                <w:b w:val="false"/>
+                <w:bCs w:val="false"/>
+                <w:sz w:val="20"/>
+                <w:szCs w:val="20"/>
+              </w:rPr>
+              <w:t xml:space="preserve">800,00</w:t>
+            </w:r>
+          </w:p>
+        </w:tc>
+        <w:tc>
+          <w:tcPr>
+            <w:tcW w:type="dxa" w:w="1500"/>
+            <w:tcMar>
+              <w:top w:type="dxa" w:w="60"/>
+              <w:left w:type="dxa" w:w="90"/>
+              <w:bottom w:type="dxa" w:w="60"/>
+              <w:right w:type="dxa" w:w="90"/>
+            </w:tcMar>
+          </w:tcPr>
+          <w:p>
+            <w:pPr>
+              <w:spacing w:after="0" w:line="240"/>
+              <w:jc w:val="right"/>
+            </w:pPr>
+            <w:r>
+              <w:rPr>
+                <w:rFonts w:ascii="Times New Roman" w:cs="Times New Roman" w:eastAsia="Times New Roman" w:hAnsi="Times New Roman"/>
+                <w:b w:val="false"/>
+                <w:bCs w:val="false"/>
+                <w:sz w:val="20"/>
+                <w:szCs w:val="20"/>
+              </w:rPr>
+              <w:t xml:space="preserve">800,00</w:t>
+            </w:r>
+          </w:p>
+        </w:tc>
+        <w:tc>
+          <w:tcPr>
+            <w:tcW w:type="dxa" w:w="1260"/>
+            <w:tcMar>
+              <w:top w:type="dxa" w:w="60"/>
+              <w:left w:type="dxa" w:w="90"/>
+              <w:bottom w:type="dxa" w:w="60"/>
+              <w:right w:type="dxa" w:w="90"/>
+            </w:tcMar>
+          </w:tcPr>
+          <w:p>
+            <w:pPr>
+              <w:spacing w:after="0" w:line="240"/>
+              <w:jc w:val="right"/>
+            </w:pPr>
+            <w:r>
+              <w:rPr>
+                <w:rFonts w:ascii="Times New Roman" w:cs="Times New Roman" w:eastAsia="Times New Roman" w:hAnsi="Times New Roman"/>
+                <w:b w:val="false"/>
+                <w:bCs w:val="false"/>
+                <w:sz w:val="20"/>
+                <w:szCs w:val="20"/>
+              </w:rPr>
+              <w:t xml:space="preserve">80,00</w:t>
             </w:r>
           </w:p>
         </w:tc>
@@ -11803,7 +12064,7 @@
       <w:tr>
         <w:tc>
           <w:tcPr>
-            <w:tcW w:type="dxa" w:w="3000"/>
+            <w:tcW w:type="dxa" w:w="2800"/>
             <w:tcMar>
               <w:top w:type="dxa" w:w="60"/>
               <w:left w:type="dxa" w:w="90"/>
@@ -11830,7 +12091,7 @@
         </w:tc>
         <w:tc>
           <w:tcPr>
-            <w:tcW w:type="dxa" w:w="1400"/>
+            <w:tcW w:type="dxa" w:w="1200"/>
             <w:tcMar>
               <w:top w:type="dxa" w:w="60"/>
               <w:left w:type="dxa" w:w="90"/>
@@ -11857,7 +12118,7 @@
         </w:tc>
         <w:tc>
           <w:tcPr>
-            <w:tcW w:type="dxa" w:w="1300"/>
+            <w:tcW w:type="dxa" w:w="1100"/>
             <w:tcMar>
               <w:top w:type="dxa" w:w="60"/>
               <w:left w:type="dxa" w:w="90"/>
@@ -11884,55 +12145,82 @@
         </w:tc>
         <w:tc>
           <w:tcPr>
-            <w:tcW w:type="dxa" w:w="1660"/>
-            <w:tcMar>
-              <w:top w:type="dxa" w:w="60"/>
-              <w:left w:type="dxa" w:w="90"/>
-              <w:bottom w:type="dxa" w:w="60"/>
-              <w:right w:type="dxa" w:w="90"/>
-            </w:tcMar>
-          </w:tcPr>
-          <w:p>
-            <w:pPr>
-              <w:spacing w:after="0" w:line="240"/>
-              <w:jc w:val="right"/>
-            </w:pPr>
-            <w:r>
-              <w:rPr>
-                <w:rFonts w:ascii="Times New Roman" w:cs="Times New Roman" w:eastAsia="Times New Roman" w:hAnsi="Times New Roman"/>
-                <w:b w:val="false"/>
-                <w:bCs w:val="false"/>
-                <w:sz w:val="20"/>
-                <w:szCs w:val="20"/>
-              </w:rPr>
-              <w:t xml:space="preserve">2.313,33</w:t>
-            </w:r>
-          </w:p>
-        </w:tc>
-        <w:tc>
-          <w:tcPr>
-            <w:tcW w:type="dxa" w:w="2000"/>
-            <w:tcMar>
-              <w:top w:type="dxa" w:w="60"/>
-              <w:left w:type="dxa" w:w="90"/>
-              <w:bottom w:type="dxa" w:w="60"/>
-              <w:right w:type="dxa" w:w="90"/>
-            </w:tcMar>
-          </w:tcPr>
-          <w:p>
-            <w:pPr>
-              <w:spacing w:after="0" w:line="240"/>
-              <w:jc w:val="right"/>
-            </w:pPr>
-            <w:r>
-              <w:rPr>
-                <w:rFonts w:ascii="Times New Roman" w:cs="Times New Roman" w:eastAsia="Times New Roman" w:hAnsi="Times New Roman"/>
-                <w:b w:val="false"/>
-                <w:bCs w:val="false"/>
-                <w:sz w:val="20"/>
-                <w:szCs w:val="20"/>
-              </w:rPr>
-              <w:t xml:space="preserve">2.313,33</w:t>
+            <w:tcW w:type="dxa" w:w="1500"/>
+            <w:tcMar>
+              <w:top w:type="dxa" w:w="60"/>
+              <w:left w:type="dxa" w:w="90"/>
+              <w:bottom w:type="dxa" w:w="60"/>
+              <w:right w:type="dxa" w:w="90"/>
+            </w:tcMar>
+          </w:tcPr>
+          <w:p>
+            <w:pPr>
+              <w:spacing w:after="0" w:line="240"/>
+              <w:jc w:val="right"/>
+            </w:pPr>
+            <w:r>
+              <w:rPr>
+                <w:rFonts w:ascii="Times New Roman" w:cs="Times New Roman" w:eastAsia="Times New Roman" w:hAnsi="Times New Roman"/>
+                <w:b w:val="false"/>
+                <w:bCs w:val="false"/>
+                <w:sz w:val="20"/>
+                <w:szCs w:val="20"/>
+              </w:rPr>
+              <w:t xml:space="preserve">2.320,00</w:t>
+            </w:r>
+          </w:p>
+        </w:tc>
+        <w:tc>
+          <w:tcPr>
+            <w:tcW w:type="dxa" w:w="1500"/>
+            <w:tcMar>
+              <w:top w:type="dxa" w:w="60"/>
+              <w:left w:type="dxa" w:w="90"/>
+              <w:bottom w:type="dxa" w:w="60"/>
+              <w:right w:type="dxa" w:w="90"/>
+            </w:tcMar>
+          </w:tcPr>
+          <w:p>
+            <w:pPr>
+              <w:spacing w:after="0" w:line="240"/>
+              <w:jc w:val="right"/>
+            </w:pPr>
+            <w:r>
+              <w:rPr>
+                <w:rFonts w:ascii="Times New Roman" w:cs="Times New Roman" w:eastAsia="Times New Roman" w:hAnsi="Times New Roman"/>
+                <w:b w:val="false"/>
+                <w:bCs w:val="false"/>
+                <w:sz w:val="20"/>
+                <w:szCs w:val="20"/>
+              </w:rPr>
+              <w:t xml:space="preserve">2.320,00</w:t>
+            </w:r>
+          </w:p>
+        </w:tc>
+        <w:tc>
+          <w:tcPr>
+            <w:tcW w:type="dxa" w:w="1260"/>
+            <w:tcMar>
+              <w:top w:type="dxa" w:w="60"/>
+              <w:left w:type="dxa" w:w="90"/>
+              <w:bottom w:type="dxa" w:w="60"/>
+              <w:right w:type="dxa" w:w="90"/>
+            </w:tcMar>
+          </w:tcPr>
+          <w:p>
+            <w:pPr>
+              <w:spacing w:after="0" w:line="240"/>
+              <w:jc w:val="right"/>
+            </w:pPr>
+            <w:r>
+              <w:rPr>
+                <w:rFonts w:ascii="Times New Roman" w:cs="Times New Roman" w:eastAsia="Times New Roman" w:hAnsi="Times New Roman"/>
+                <w:b w:val="false"/>
+                <w:bCs w:val="false"/>
+                <w:sz w:val="20"/>
+                <w:szCs w:val="20"/>
+              </w:rPr>
+              <w:t xml:space="preserve">232,00</w:t>
             </w:r>
           </w:p>
         </w:tc>
@@ -11940,7 +12228,7 @@
       <w:tr>
         <w:tc>
           <w:tcPr>
-            <w:tcW w:type="dxa" w:w="3000"/>
+            <w:tcW w:type="dxa" w:w="2800"/>
             <w:tcMar>
               <w:top w:type="dxa" w:w="60"/>
               <w:left w:type="dxa" w:w="90"/>
@@ -11961,13 +12249,13 @@
                 <w:sz w:val="20"/>
                 <w:szCs w:val="20"/>
               </w:rPr>
-              <w:t xml:space="preserve">Legal básico (amortizado a 12 meses)</w:t>
-            </w:r>
-          </w:p>
-        </w:tc>
-        <w:tc>
-          <w:tcPr>
-            <w:tcW w:type="dxa" w:w="1400"/>
+              <w:t xml:space="preserve">Legal básico (amortizado 12 meses)</w:t>
+            </w:r>
+          </w:p>
+        </w:tc>
+        <w:tc>
+          <w:tcPr>
+            <w:tcW w:type="dxa" w:w="1200"/>
             <w:tcMar>
               <w:top w:type="dxa" w:w="60"/>
               <w:left w:type="dxa" w:w="90"/>
@@ -11994,7 +12282,7 @@
         </w:tc>
         <w:tc>
           <w:tcPr>
-            <w:tcW w:type="dxa" w:w="1300"/>
+            <w:tcW w:type="dxa" w:w="1100"/>
             <w:tcMar>
               <w:top w:type="dxa" w:w="60"/>
               <w:left w:type="dxa" w:w="90"/>
@@ -12021,55 +12309,82 @@
         </w:tc>
         <w:tc>
           <w:tcPr>
-            <w:tcW w:type="dxa" w:w="1660"/>
-            <w:tcMar>
-              <w:top w:type="dxa" w:w="60"/>
-              <w:left w:type="dxa" w:w="90"/>
-              <w:bottom w:type="dxa" w:w="60"/>
-              <w:right w:type="dxa" w:w="90"/>
-            </w:tcMar>
-          </w:tcPr>
-          <w:p>
-            <w:pPr>
-              <w:spacing w:after="0" w:line="240"/>
-              <w:jc w:val="right"/>
-            </w:pPr>
-            <w:r>
-              <w:rPr>
-                <w:rFonts w:ascii="Times New Roman" w:cs="Times New Roman" w:eastAsia="Times New Roman" w:hAnsi="Times New Roman"/>
-                <w:b w:val="false"/>
-                <w:bCs w:val="false"/>
-                <w:sz w:val="20"/>
-                <w:szCs w:val="20"/>
-              </w:rPr>
-              <w:t xml:space="preserve">125,00</w:t>
-            </w:r>
-          </w:p>
-        </w:tc>
-        <w:tc>
-          <w:tcPr>
-            <w:tcW w:type="dxa" w:w="2000"/>
-            <w:tcMar>
-              <w:top w:type="dxa" w:w="60"/>
-              <w:left w:type="dxa" w:w="90"/>
-              <w:bottom w:type="dxa" w:w="60"/>
-              <w:right w:type="dxa" w:w="90"/>
-            </w:tcMar>
-          </w:tcPr>
-          <w:p>
-            <w:pPr>
-              <w:spacing w:after="0" w:line="240"/>
-              <w:jc w:val="right"/>
-            </w:pPr>
-            <w:r>
-              <w:rPr>
-                <w:rFonts w:ascii="Times New Roman" w:cs="Times New Roman" w:eastAsia="Times New Roman" w:hAnsi="Times New Roman"/>
-                <w:b w:val="false"/>
-                <w:bCs w:val="false"/>
-                <w:sz w:val="20"/>
-                <w:szCs w:val="20"/>
-              </w:rPr>
-              <w:t xml:space="preserve">125,00</w:t>
+            <w:tcW w:type="dxa" w:w="1500"/>
+            <w:tcMar>
+              <w:top w:type="dxa" w:w="60"/>
+              <w:left w:type="dxa" w:w="90"/>
+              <w:bottom w:type="dxa" w:w="60"/>
+              <w:right w:type="dxa" w:w="90"/>
+            </w:tcMar>
+          </w:tcPr>
+          <w:p>
+            <w:pPr>
+              <w:spacing w:after="0" w:line="240"/>
+              <w:jc w:val="right"/>
+            </w:pPr>
+            <w:r>
+              <w:rPr>
+                <w:rFonts w:ascii="Times New Roman" w:cs="Times New Roman" w:eastAsia="Times New Roman" w:hAnsi="Times New Roman"/>
+                <w:b w:val="false"/>
+                <w:bCs w:val="false"/>
+                <w:sz w:val="20"/>
+                <w:szCs w:val="20"/>
+              </w:rPr>
+              <w:t xml:space="preserve">130,00</w:t>
+            </w:r>
+          </w:p>
+        </w:tc>
+        <w:tc>
+          <w:tcPr>
+            <w:tcW w:type="dxa" w:w="1500"/>
+            <w:tcMar>
+              <w:top w:type="dxa" w:w="60"/>
+              <w:left w:type="dxa" w:w="90"/>
+              <w:bottom w:type="dxa" w:w="60"/>
+              <w:right w:type="dxa" w:w="90"/>
+            </w:tcMar>
+          </w:tcPr>
+          <w:p>
+            <w:pPr>
+              <w:spacing w:after="0" w:line="240"/>
+              <w:jc w:val="right"/>
+            </w:pPr>
+            <w:r>
+              <w:rPr>
+                <w:rFonts w:ascii="Times New Roman" w:cs="Times New Roman" w:eastAsia="Times New Roman" w:hAnsi="Times New Roman"/>
+                <w:b w:val="false"/>
+                <w:bCs w:val="false"/>
+                <w:sz w:val="20"/>
+                <w:szCs w:val="20"/>
+              </w:rPr>
+              <w:t xml:space="preserve">130,00</w:t>
+            </w:r>
+          </w:p>
+        </w:tc>
+        <w:tc>
+          <w:tcPr>
+            <w:tcW w:type="dxa" w:w="1260"/>
+            <w:tcMar>
+              <w:top w:type="dxa" w:w="60"/>
+              <w:left w:type="dxa" w:w="90"/>
+              <w:bottom w:type="dxa" w:w="60"/>
+              <w:right w:type="dxa" w:w="90"/>
+            </w:tcMar>
+          </w:tcPr>
+          <w:p>
+            <w:pPr>
+              <w:spacing w:after="0" w:line="240"/>
+              <w:jc w:val="right"/>
+            </w:pPr>
+            <w:r>
+              <w:rPr>
+                <w:rFonts w:ascii="Times New Roman" w:cs="Times New Roman" w:eastAsia="Times New Roman" w:hAnsi="Times New Roman"/>
+                <w:b w:val="false"/>
+                <w:bCs w:val="false"/>
+                <w:sz w:val="20"/>
+                <w:szCs w:val="20"/>
+              </w:rPr>
+              <w:t xml:space="preserve">13,00</w:t>
             </w:r>
           </w:p>
         </w:tc>
@@ -12077,7 +12392,7 @@
       <w:tr>
         <w:tc>
           <w:tcPr>
-            <w:tcW w:type="dxa" w:w="3000"/>
+            <w:tcW w:type="dxa" w:w="2800"/>
             <w:tcMar>
               <w:top w:type="dxa" w:w="60"/>
               <w:left w:type="dxa" w:w="90"/>
@@ -12098,13 +12413,13 @@
                 <w:sz w:val="20"/>
                 <w:szCs w:val="20"/>
               </w:rPr>
-              <w:t xml:space="preserve">Dominio (amortizado a 12 meses)</w:t>
-            </w:r>
-          </w:p>
-        </w:tc>
-        <w:tc>
-          <w:tcPr>
-            <w:tcW w:type="dxa" w:w="1400"/>
+              <w:t xml:space="preserve">Dominio (amortizado 12 meses)</w:t>
+            </w:r>
+          </w:p>
+        </w:tc>
+        <w:tc>
+          <w:tcPr>
+            <w:tcW w:type="dxa" w:w="1200"/>
             <w:tcMar>
               <w:top w:type="dxa" w:w="60"/>
               <w:left w:type="dxa" w:w="90"/>
@@ -12131,7 +12446,7 @@
         </w:tc>
         <w:tc>
           <w:tcPr>
-            <w:tcW w:type="dxa" w:w="1300"/>
+            <w:tcW w:type="dxa" w:w="1100"/>
             <w:tcMar>
               <w:top w:type="dxa" w:w="60"/>
               <w:left w:type="dxa" w:w="90"/>
@@ -12158,55 +12473,82 @@
         </w:tc>
         <w:tc>
           <w:tcPr>
-            <w:tcW w:type="dxa" w:w="1660"/>
-            <w:tcMar>
-              <w:top w:type="dxa" w:w="60"/>
-              <w:left w:type="dxa" w:w="90"/>
-              <w:bottom w:type="dxa" w:w="60"/>
-              <w:right w:type="dxa" w:w="90"/>
-            </w:tcMar>
-          </w:tcPr>
-          <w:p>
-            <w:pPr>
-              <w:spacing w:after="0" w:line="240"/>
-              <w:jc w:val="right"/>
-            </w:pPr>
-            <w:r>
-              <w:rPr>
-                <w:rFonts w:ascii="Times New Roman" w:cs="Times New Roman" w:eastAsia="Times New Roman" w:hAnsi="Times New Roman"/>
-                <w:b w:val="false"/>
-                <w:bCs w:val="false"/>
-                <w:sz w:val="20"/>
-                <w:szCs w:val="20"/>
-              </w:rPr>
-              <w:t xml:space="preserve">8,33</w:t>
-            </w:r>
-          </w:p>
-        </w:tc>
-        <w:tc>
-          <w:tcPr>
-            <w:tcW w:type="dxa" w:w="2000"/>
-            <w:tcMar>
-              <w:top w:type="dxa" w:w="60"/>
-              <w:left w:type="dxa" w:w="90"/>
-              <w:bottom w:type="dxa" w:w="60"/>
-              <w:right w:type="dxa" w:w="90"/>
-            </w:tcMar>
-          </w:tcPr>
-          <w:p>
-            <w:pPr>
-              <w:spacing w:after="0" w:line="240"/>
-              <w:jc w:val="right"/>
-            </w:pPr>
-            <w:r>
-              <w:rPr>
-                <w:rFonts w:ascii="Times New Roman" w:cs="Times New Roman" w:eastAsia="Times New Roman" w:hAnsi="Times New Roman"/>
-                <w:b w:val="false"/>
-                <w:bCs w:val="false"/>
-                <w:sz w:val="20"/>
-                <w:szCs w:val="20"/>
-              </w:rPr>
-              <w:t xml:space="preserve">8,33</w:t>
+            <w:tcW w:type="dxa" w:w="1500"/>
+            <w:tcMar>
+              <w:top w:type="dxa" w:w="60"/>
+              <w:left w:type="dxa" w:w="90"/>
+              <w:bottom w:type="dxa" w:w="60"/>
+              <w:right w:type="dxa" w:w="90"/>
+            </w:tcMar>
+          </w:tcPr>
+          <w:p>
+            <w:pPr>
+              <w:spacing w:after="0" w:line="240"/>
+              <w:jc w:val="right"/>
+            </w:pPr>
+            <w:r>
+              <w:rPr>
+                <w:rFonts w:ascii="Times New Roman" w:cs="Times New Roman" w:eastAsia="Times New Roman" w:hAnsi="Times New Roman"/>
+                <w:b w:val="false"/>
+                <w:bCs w:val="false"/>
+                <w:sz w:val="20"/>
+                <w:szCs w:val="20"/>
+              </w:rPr>
+              <w:t xml:space="preserve">10,00</w:t>
+            </w:r>
+          </w:p>
+        </w:tc>
+        <w:tc>
+          <w:tcPr>
+            <w:tcW w:type="dxa" w:w="1500"/>
+            <w:tcMar>
+              <w:top w:type="dxa" w:w="60"/>
+              <w:left w:type="dxa" w:w="90"/>
+              <w:bottom w:type="dxa" w:w="60"/>
+              <w:right w:type="dxa" w:w="90"/>
+            </w:tcMar>
+          </w:tcPr>
+          <w:p>
+            <w:pPr>
+              <w:spacing w:after="0" w:line="240"/>
+              <w:jc w:val="right"/>
+            </w:pPr>
+            <w:r>
+              <w:rPr>
+                <w:rFonts w:ascii="Times New Roman" w:cs="Times New Roman" w:eastAsia="Times New Roman" w:hAnsi="Times New Roman"/>
+                <w:b w:val="false"/>
+                <w:bCs w:val="false"/>
+                <w:sz w:val="20"/>
+                <w:szCs w:val="20"/>
+              </w:rPr>
+              <w:t xml:space="preserve">10,00</w:t>
+            </w:r>
+          </w:p>
+        </w:tc>
+        <w:tc>
+          <w:tcPr>
+            <w:tcW w:type="dxa" w:w="1260"/>
+            <w:tcMar>
+              <w:top w:type="dxa" w:w="60"/>
+              <w:left w:type="dxa" w:w="90"/>
+              <w:bottom w:type="dxa" w:w="60"/>
+              <w:right w:type="dxa" w:w="90"/>
+            </w:tcMar>
+          </w:tcPr>
+          <w:p>
+            <w:pPr>
+              <w:spacing w:after="0" w:line="240"/>
+              <w:jc w:val="right"/>
+            </w:pPr>
+            <w:r>
+              <w:rPr>
+                <w:rFonts w:ascii="Times New Roman" w:cs="Times New Roman" w:eastAsia="Times New Roman" w:hAnsi="Times New Roman"/>
+                <w:b w:val="false"/>
+                <w:bCs w:val="false"/>
+                <w:sz w:val="20"/>
+                <w:szCs w:val="20"/>
+              </w:rPr>
+              <w:t xml:space="preserve">1,00</w:t>
             </w:r>
           </w:p>
         </w:tc>
@@ -12214,7 +12556,7 @@
       <w:tr>
         <w:tc>
           <w:tcPr>
-            <w:tcW w:type="dxa" w:w="3000"/>
+            <w:tcW w:type="dxa" w:w="2800"/>
             <w:tcMar>
               <w:top w:type="dxa" w:w="60"/>
               <w:left w:type="dxa" w:w="90"/>
@@ -12241,7 +12583,7 @@
         </w:tc>
         <w:tc>
           <w:tcPr>
-            <w:tcW w:type="dxa" w:w="1400"/>
+            <w:tcW w:type="dxa" w:w="1200"/>
             <w:tcMar>
               <w:top w:type="dxa" w:w="60"/>
               <w:left w:type="dxa" w:w="90"/>
@@ -12268,7 +12610,7 @@
         </w:tc>
         <w:tc>
           <w:tcPr>
-            <w:tcW w:type="dxa" w:w="1300"/>
+            <w:tcW w:type="dxa" w:w="1100"/>
             <w:tcMar>
               <w:top w:type="dxa" w:w="60"/>
               <w:left w:type="dxa" w:w="90"/>
@@ -12295,7 +12637,7 @@
         </w:tc>
         <w:tc>
           <w:tcPr>
-            <w:tcW w:type="dxa" w:w="1660"/>
+            <w:tcW w:type="dxa" w:w="1500"/>
             <w:tcMar>
               <w:top w:type="dxa" w:w="60"/>
               <w:left w:type="dxa" w:w="90"/>
@@ -12322,7 +12664,34 @@
         </w:tc>
         <w:tc>
           <w:tcPr>
-            <w:tcW w:type="dxa" w:w="2000"/>
+            <w:tcW w:type="dxa" w:w="1500"/>
+            <w:tcMar>
+              <w:top w:type="dxa" w:w="60"/>
+              <w:left w:type="dxa" w:w="90"/>
+              <w:bottom w:type="dxa" w:w="60"/>
+              <w:right w:type="dxa" w:w="90"/>
+            </w:tcMar>
+          </w:tcPr>
+          <w:p>
+            <w:pPr>
+              <w:spacing w:after="0" w:line="240"/>
+              <w:jc w:val="right"/>
+            </w:pPr>
+            <w:r>
+              <w:rPr>
+                <w:rFonts w:ascii="Times New Roman" w:cs="Times New Roman" w:eastAsia="Times New Roman" w:hAnsi="Times New Roman"/>
+                <w:b w:val="false"/>
+                <w:bCs w:val="false"/>
+                <w:sz w:val="20"/>
+                <w:szCs w:val="20"/>
+              </w:rPr>
+              <w:t xml:space="preserve">0,00</w:t>
+            </w:r>
+          </w:p>
+        </w:tc>
+        <w:tc>
+          <w:tcPr>
+            <w:tcW w:type="dxa" w:w="1260"/>
             <w:tcMar>
               <w:top w:type="dxa" w:w="60"/>
               <w:left w:type="dxa" w:w="90"/>
@@ -12351,7 +12720,7 @@
       <w:tr>
         <w:tc>
           <w:tcPr>
-            <w:tcW w:type="dxa" w:w="3000"/>
+            <w:tcW w:type="dxa" w:w="2800"/>
             <w:shd w:fill="F4B183" w:color="auto" w:val="clear"/>
             <w:tcMar>
               <w:top w:type="dxa" w:w="60"/>
@@ -12379,7 +12748,7 @@
         </w:tc>
         <w:tc>
           <w:tcPr>
-            <w:tcW w:type="dxa" w:w="1400"/>
+            <w:tcW w:type="dxa" w:w="1200"/>
             <w:shd w:fill="F4B183" w:color="auto" w:val="clear"/>
             <w:tcMar>
               <w:top w:type="dxa" w:w="60"/>
@@ -12407,7 +12776,7 @@
         </w:tc>
         <w:tc>
           <w:tcPr>
-            <w:tcW w:type="dxa" w:w="1300"/>
+            <w:tcW w:type="dxa" w:w="1100"/>
             <w:shd w:fill="F4B183" w:color="auto" w:val="clear"/>
             <w:tcMar>
               <w:top w:type="dxa" w:w="60"/>
@@ -12435,7 +12804,7 @@
         </w:tc>
         <w:tc>
           <w:tcPr>
-            <w:tcW w:type="dxa" w:w="1660"/>
+            <w:tcW w:type="dxa" w:w="1500"/>
             <w:shd w:fill="F4B183" w:color="auto" w:val="clear"/>
             <w:tcMar>
               <w:top w:type="dxa" w:w="60"/>
@@ -12463,7 +12832,7 @@
         </w:tc>
         <w:tc>
           <w:tcPr>
-            <w:tcW w:type="dxa" w:w="2000"/>
+            <w:tcW w:type="dxa" w:w="1500"/>
             <w:shd w:fill="F4B183" w:color="auto" w:val="clear"/>
             <w:tcMar>
               <w:top w:type="dxa" w:w="60"/>
@@ -12485,7 +12854,35 @@
                 <w:sz w:val="20"/>
                 <w:szCs w:val="20"/>
               </w:rPr>
-              <w:t xml:space="preserve">3.266,66</w:t>
+              <w:t xml:space="preserve">3.260,00</w:t>
+            </w:r>
+          </w:p>
+        </w:tc>
+        <w:tc>
+          <w:tcPr>
+            <w:tcW w:type="dxa" w:w="1260"/>
+            <w:shd w:fill="F4B183" w:color="auto" w:val="clear"/>
+            <w:tcMar>
+              <w:top w:type="dxa" w:w="60"/>
+              <w:left w:type="dxa" w:w="90"/>
+              <w:bottom w:type="dxa" w:w="60"/>
+              <w:right w:type="dxa" w:w="90"/>
+            </w:tcMar>
+          </w:tcPr>
+          <w:p>
+            <w:pPr>
+              <w:spacing w:after="0" w:line="240"/>
+              <w:jc w:val="right"/>
+            </w:pPr>
+            <w:r>
+              <w:rPr>
+                <w:rFonts w:ascii="Times New Roman" w:cs="Times New Roman" w:eastAsia="Times New Roman" w:hAnsi="Times New Roman"/>
+                <w:b/>
+                <w:bCs/>
+                <w:sz w:val="20"/>
+                <w:szCs w:val="20"/>
+              </w:rPr>
+              <w:t xml:space="preserve">326,00</w:t>
             </w:r>
           </w:p>
         </w:tc>
@@ -12504,7 +12901,7 @@
           <w:sz w:val="18"/>
           <w:szCs w:val="18"/>
         </w:rPr>
-        <w:t xml:space="preserve">Tabla 16. Costos fijos mensuales durante la fase semilla (meses 1 a 3). A partir del mes 4, al agotarse el presupuesto de activación, los costos fijos bajan a Bs 953,33 mensuales.</w:t>
+        <w:t xml:space="preserve">Tabla 16. Costos fijos mensuales durante la fase semilla (meses 1 a 3). A partir del mes 4, al agotarse el presupuesto de activación, los costos fijos bajan a Bs 940,00 mensuales (US$ 94,00).</w:t>
       </w:r>
     </w:p>
     <w:p>
@@ -12742,7 +13139,7 @@
                 <w:sz w:val="20"/>
                 <w:szCs w:val="20"/>
               </w:rPr>
-              <w:t xml:space="preserve">6.940</w:t>
+              <w:t xml:space="preserve">6.960</w:t>
             </w:r>
           </w:p>
         </w:tc>
@@ -12769,7 +13166,7 @@
                 <w:sz w:val="20"/>
                 <w:szCs w:val="20"/>
               </w:rPr>
-              <w:t xml:space="preserve">706</w:t>
+              <w:t xml:space="preserve">696</w:t>
             </w:r>
           </w:p>
         </w:tc>
@@ -12852,7 +13249,7 @@
                 <w:sz w:val="20"/>
                 <w:szCs w:val="20"/>
               </w:rPr>
-              <w:t xml:space="preserve">2.460</w:t>
+              <w:t xml:space="preserve">2.400</w:t>
             </w:r>
           </w:p>
         </w:tc>
@@ -12879,7 +13276,7 @@
                 <w:sz w:val="20"/>
                 <w:szCs w:val="20"/>
               </w:rPr>
-              <w:t xml:space="preserve">250</w:t>
+              <w:t xml:space="preserve">240</w:t>
             </w:r>
           </w:p>
         </w:tc>
@@ -12962,7 +13359,7 @@
                 <w:sz w:val="20"/>
                 <w:szCs w:val="20"/>
               </w:rPr>
-              <w:t xml:space="preserve">1.500</w:t>
+              <w:t xml:space="preserve">1.560</w:t>
             </w:r>
           </w:p>
         </w:tc>
@@ -12989,7 +13386,7 @@
                 <w:sz w:val="20"/>
                 <w:szCs w:val="20"/>
               </w:rPr>
-              <w:t xml:space="preserve">153</w:t>
+              <w:t xml:space="preserve">156</w:t>
             </w:r>
           </w:p>
         </w:tc>
@@ -13072,7 +13469,7 @@
                 <w:sz w:val="20"/>
                 <w:szCs w:val="20"/>
               </w:rPr>
-              <w:t xml:space="preserve">1.000</w:t>
+              <w:t xml:space="preserve">960</w:t>
             </w:r>
           </w:p>
         </w:tc>
@@ -13099,7 +13496,7 @@
                 <w:sz w:val="20"/>
                 <w:szCs w:val="20"/>
               </w:rPr>
-              <w:t xml:space="preserve">102</w:t>
+              <w:t xml:space="preserve">96</w:t>
             </w:r>
           </w:p>
         </w:tc>
@@ -13182,7 +13579,7 @@
                 <w:sz w:val="20"/>
                 <w:szCs w:val="20"/>
               </w:rPr>
-              <w:t xml:space="preserve">100</w:t>
+              <w:t xml:space="preserve">120</w:t>
             </w:r>
           </w:p>
         </w:tc>
@@ -13209,7 +13606,7 @@
                 <w:sz w:val="20"/>
                 <w:szCs w:val="20"/>
               </w:rPr>
-              <w:t xml:space="preserve">10</w:t>
+              <w:t xml:space="preserve">12</w:t>
             </w:r>
           </w:p>
         </w:tc>
@@ -13323,7 +13720,7 @@
                 <w:sz w:val="20"/>
                 <w:szCs w:val="20"/>
               </w:rPr>
-              <w:t xml:space="preserve">1.221</w:t>
+              <w:t xml:space="preserve">1.200</w:t>
             </w:r>
           </w:p>
         </w:tc>
@@ -13376,8 +13773,9 @@
         </w:tblBorders>
       </w:tblPr>
       <w:tblGrid>
-        <w:gridCol w:w="5360"/>
-        <w:gridCol w:w="4000"/>
+        <w:gridCol w:w="4560"/>
+        <w:gridCol w:w="2400"/>
+        <w:gridCol w:w="2400"/>
       </w:tblGrid>
       <w:tr>
         <w:trPr>
@@ -13385,7 +13783,7 @@
         </w:trPr>
         <w:tc>
           <w:tcPr>
-            <w:tcW w:type="dxa" w:w="5360"/>
+            <w:tcW w:type="dxa" w:w="4560"/>
             <w:shd w:fill="1F3864" w:color="auto" w:val="clear"/>
             <w:tcMar>
               <w:top w:type="dxa" w:w="60"/>
@@ -13414,7 +13812,7 @@
         </w:tc>
         <w:tc>
           <w:tcPr>
-            <w:tcW w:type="dxa" w:w="4000"/>
+            <w:tcW w:type="dxa" w:w="2400"/>
             <w:shd w:fill="1F3864" w:color="auto" w:val="clear"/>
             <w:tcMar>
               <w:top w:type="dxa" w:w="60"/>
@@ -13441,11 +13839,40 @@
             </w:r>
           </w:p>
         </w:tc>
+        <w:tc>
+          <w:tcPr>
+            <w:tcW w:type="dxa" w:w="2400"/>
+            <w:shd w:fill="1F3864" w:color="auto" w:val="clear"/>
+            <w:tcMar>
+              <w:top w:type="dxa" w:w="60"/>
+              <w:left w:type="dxa" w:w="90"/>
+              <w:bottom w:type="dxa" w:w="60"/>
+              <w:right w:type="dxa" w:w="90"/>
+            </w:tcMar>
+          </w:tcPr>
+          <w:p>
+            <w:pPr>
+              <w:spacing w:after="0" w:line="240"/>
+              <w:jc w:val="center"/>
+            </w:pPr>
+            <w:r>
+              <w:rPr>
+                <w:rFonts w:ascii="Times New Roman" w:cs="Times New Roman" w:eastAsia="Times New Roman" w:hAnsi="Times New Roman"/>
+                <w:b/>
+                <w:bCs/>
+                <w:color w:val="FFFFFF"/>
+                <w:sz w:val="20"/>
+                <w:szCs w:val="20"/>
+              </w:rPr>
+              <w:t xml:space="preserve">Total mensual (US$)</w:t>
+            </w:r>
+          </w:p>
+        </w:tc>
       </w:tr>
       <w:tr>
         <w:tc>
           <w:tcPr>
-            <w:tcW w:type="dxa" w:w="5360"/>
+            <w:tcW w:type="dxa" w:w="4560"/>
             <w:tcMar>
               <w:top w:type="dxa" w:w="60"/>
               <w:left w:type="dxa" w:w="90"/>
@@ -13472,7 +13899,7 @@
         </w:tc>
         <w:tc>
           <w:tcPr>
-            <w:tcW w:type="dxa" w:w="4000"/>
+            <w:tcW w:type="dxa" w:w="2400"/>
             <w:tcMar>
               <w:top w:type="dxa" w:w="60"/>
               <w:left w:type="dxa" w:w="90"/>
@@ -13494,6 +13921,33 @@
                 <w:szCs w:val="20"/>
               </w:rPr>
               <w:t xml:space="preserve">125,20</w:t>
+            </w:r>
+          </w:p>
+        </w:tc>
+        <w:tc>
+          <w:tcPr>
+            <w:tcW w:type="dxa" w:w="2400"/>
+            <w:tcMar>
+              <w:top w:type="dxa" w:w="60"/>
+              <w:left w:type="dxa" w:w="90"/>
+              <w:bottom w:type="dxa" w:w="60"/>
+              <w:right w:type="dxa" w:w="90"/>
+            </w:tcMar>
+          </w:tcPr>
+          <w:p>
+            <w:pPr>
+              <w:spacing w:after="0" w:line="240"/>
+              <w:jc w:val="right"/>
+            </w:pPr>
+            <w:r>
+              <w:rPr>
+                <w:rFonts w:ascii="Times New Roman" w:cs="Times New Roman" w:eastAsia="Times New Roman" w:hAnsi="Times New Roman"/>
+                <w:b w:val="false"/>
+                <w:bCs w:val="false"/>
+                <w:sz w:val="20"/>
+                <w:szCs w:val="20"/>
+              </w:rPr>
+              <w:t xml:space="preserve">12,52</w:t>
             </w:r>
           </w:p>
         </w:tc>
@@ -13501,7 +13955,7 @@
       <w:tr>
         <w:tc>
           <w:tcPr>
-            <w:tcW w:type="dxa" w:w="5360"/>
+            <w:tcW w:type="dxa" w:w="4560"/>
             <w:tcMar>
               <w:top w:type="dxa" w:w="60"/>
               <w:left w:type="dxa" w:w="90"/>
@@ -13528,7 +13982,7 @@
         </w:tc>
         <w:tc>
           <w:tcPr>
-            <w:tcW w:type="dxa" w:w="4000"/>
+            <w:tcW w:type="dxa" w:w="2400"/>
             <w:tcMar>
               <w:top w:type="dxa" w:w="60"/>
               <w:left w:type="dxa" w:w="90"/>
@@ -13550,6 +14004,33 @@
                 <w:szCs w:val="20"/>
               </w:rPr>
               <w:t xml:space="preserve">1.700,00</w:t>
+            </w:r>
+          </w:p>
+        </w:tc>
+        <w:tc>
+          <w:tcPr>
+            <w:tcW w:type="dxa" w:w="2400"/>
+            <w:tcMar>
+              <w:top w:type="dxa" w:w="60"/>
+              <w:left w:type="dxa" w:w="90"/>
+              <w:bottom w:type="dxa" w:w="60"/>
+              <w:right w:type="dxa" w:w="90"/>
+            </w:tcMar>
+          </w:tcPr>
+          <w:p>
+            <w:pPr>
+              <w:spacing w:after="0" w:line="240"/>
+              <w:jc w:val="right"/>
+            </w:pPr>
+            <w:r>
+              <w:rPr>
+                <w:rFonts w:ascii="Times New Roman" w:cs="Times New Roman" w:eastAsia="Times New Roman" w:hAnsi="Times New Roman"/>
+                <w:b w:val="false"/>
+                <w:bCs w:val="false"/>
+                <w:sz w:val="20"/>
+                <w:szCs w:val="20"/>
+              </w:rPr>
+              <w:t xml:space="preserve">170,00</w:t>
             </w:r>
           </w:p>
         </w:tc>
@@ -13557,7 +14038,7 @@
       <w:tr>
         <w:tc>
           <w:tcPr>
-            <w:tcW w:type="dxa" w:w="5360"/>
+            <w:tcW w:type="dxa" w:w="4560"/>
             <w:tcMar>
               <w:top w:type="dxa" w:w="60"/>
               <w:left w:type="dxa" w:w="90"/>
@@ -13584,28 +14065,55 @@
         </w:tc>
         <w:tc>
           <w:tcPr>
-            <w:tcW w:type="dxa" w:w="4000"/>
-            <w:tcMar>
-              <w:top w:type="dxa" w:w="60"/>
-              <w:left w:type="dxa" w:w="90"/>
-              <w:bottom w:type="dxa" w:w="60"/>
-              <w:right w:type="dxa" w:w="90"/>
-            </w:tcMar>
-          </w:tcPr>
-          <w:p>
-            <w:pPr>
-              <w:spacing w:after="0" w:line="240"/>
-              <w:jc w:val="right"/>
-            </w:pPr>
-            <w:r>
-              <w:rPr>
-                <w:rFonts w:ascii="Times New Roman" w:cs="Times New Roman" w:eastAsia="Times New Roman" w:hAnsi="Times New Roman"/>
-                <w:b w:val="false"/>
-                <w:bCs w:val="false"/>
-                <w:sz w:val="20"/>
-                <w:szCs w:val="20"/>
-              </w:rPr>
-              <w:t xml:space="preserve">3.266,66</w:t>
+            <w:tcW w:type="dxa" w:w="2400"/>
+            <w:tcMar>
+              <w:top w:type="dxa" w:w="60"/>
+              <w:left w:type="dxa" w:w="90"/>
+              <w:bottom w:type="dxa" w:w="60"/>
+              <w:right w:type="dxa" w:w="90"/>
+            </w:tcMar>
+          </w:tcPr>
+          <w:p>
+            <w:pPr>
+              <w:spacing w:after="0" w:line="240"/>
+              <w:jc w:val="right"/>
+            </w:pPr>
+            <w:r>
+              <w:rPr>
+                <w:rFonts w:ascii="Times New Roman" w:cs="Times New Roman" w:eastAsia="Times New Roman" w:hAnsi="Times New Roman"/>
+                <w:b w:val="false"/>
+                <w:bCs w:val="false"/>
+                <w:sz w:val="20"/>
+                <w:szCs w:val="20"/>
+              </w:rPr>
+              <w:t xml:space="preserve">3.260,00</w:t>
+            </w:r>
+          </w:p>
+        </w:tc>
+        <w:tc>
+          <w:tcPr>
+            <w:tcW w:type="dxa" w:w="2400"/>
+            <w:tcMar>
+              <w:top w:type="dxa" w:w="60"/>
+              <w:left w:type="dxa" w:w="90"/>
+              <w:bottom w:type="dxa" w:w="60"/>
+              <w:right w:type="dxa" w:w="90"/>
+            </w:tcMar>
+          </w:tcPr>
+          <w:p>
+            <w:pPr>
+              <w:spacing w:after="0" w:line="240"/>
+              <w:jc w:val="right"/>
+            </w:pPr>
+            <w:r>
+              <w:rPr>
+                <w:rFonts w:ascii="Times New Roman" w:cs="Times New Roman" w:eastAsia="Times New Roman" w:hAnsi="Times New Roman"/>
+                <w:b w:val="false"/>
+                <w:bCs w:val="false"/>
+                <w:sz w:val="20"/>
+                <w:szCs w:val="20"/>
+              </w:rPr>
+              <w:t xml:space="preserve">326,00</w:t>
             </w:r>
           </w:p>
         </w:tc>
@@ -13613,7 +14121,7 @@
       <w:tr>
         <w:tc>
           <w:tcPr>
-            <w:tcW w:type="dxa" w:w="5360"/>
+            <w:tcW w:type="dxa" w:w="4560"/>
             <w:shd w:fill="FBE4D5" w:color="auto" w:val="clear"/>
             <w:tcMar>
               <w:top w:type="dxa" w:w="60"/>
@@ -13641,7 +14149,7 @@
         </w:tc>
         <w:tc>
           <w:tcPr>
-            <w:tcW w:type="dxa" w:w="4000"/>
+            <w:tcW w:type="dxa" w:w="2400"/>
             <w:shd w:fill="FBE4D5" w:color="auto" w:val="clear"/>
             <w:tcMar>
               <w:top w:type="dxa" w:w="60"/>
@@ -13663,7 +14171,35 @@
                 <w:sz w:val="20"/>
                 <w:szCs w:val="20"/>
               </w:rPr>
-              <w:t xml:space="preserve">5.091,86</w:t>
+              <w:t xml:space="preserve">5.085,20</w:t>
+            </w:r>
+          </w:p>
+        </w:tc>
+        <w:tc>
+          <w:tcPr>
+            <w:tcW w:type="dxa" w:w="2400"/>
+            <w:shd w:fill="FBE4D5" w:color="auto" w:val="clear"/>
+            <w:tcMar>
+              <w:top w:type="dxa" w:w="60"/>
+              <w:left w:type="dxa" w:w="90"/>
+              <w:bottom w:type="dxa" w:w="60"/>
+              <w:right w:type="dxa" w:w="90"/>
+            </w:tcMar>
+          </w:tcPr>
+          <w:p>
+            <w:pPr>
+              <w:spacing w:after="0" w:line="240"/>
+              <w:jc w:val="right"/>
+            </w:pPr>
+            <w:r>
+              <w:rPr>
+                <w:rFonts w:ascii="Times New Roman" w:cs="Times New Roman" w:eastAsia="Times New Roman" w:hAnsi="Times New Roman"/>
+                <w:b/>
+                <w:bCs/>
+                <w:sz w:val="20"/>
+                <w:szCs w:val="20"/>
+              </w:rPr>
+              <w:t xml:space="preserve">508,52</w:t>
             </w:r>
           </w:p>
         </w:tc>
@@ -13671,7 +14207,7 @@
       <w:tr>
         <w:tc>
           <w:tcPr>
-            <w:tcW w:type="dxa" w:w="5360"/>
+            <w:tcW w:type="dxa" w:w="4560"/>
             <w:tcMar>
               <w:top w:type="dxa" w:w="60"/>
               <w:left w:type="dxa" w:w="90"/>
@@ -13698,28 +14234,55 @@
         </w:tc>
         <w:tc>
           <w:tcPr>
-            <w:tcW w:type="dxa" w:w="4000"/>
-            <w:tcMar>
-              <w:top w:type="dxa" w:w="60"/>
-              <w:left w:type="dxa" w:w="90"/>
-              <w:bottom w:type="dxa" w:w="60"/>
-              <w:right w:type="dxa" w:w="90"/>
-            </w:tcMar>
-          </w:tcPr>
-          <w:p>
-            <w:pPr>
-              <w:spacing w:after="0" w:line="240"/>
-              <w:jc w:val="right"/>
-            </w:pPr>
-            <w:r>
-              <w:rPr>
-                <w:rFonts w:ascii="Times New Roman" w:cs="Times New Roman" w:eastAsia="Times New Roman" w:hAnsi="Times New Roman"/>
-                <w:b w:val="false"/>
-                <w:bCs w:val="false"/>
-                <w:sz w:val="20"/>
-                <w:szCs w:val="20"/>
-              </w:rPr>
-              <w:t xml:space="preserve">1.018,37</w:t>
+            <w:tcW w:type="dxa" w:w="2400"/>
+            <w:tcMar>
+              <w:top w:type="dxa" w:w="60"/>
+              <w:left w:type="dxa" w:w="90"/>
+              <w:bottom w:type="dxa" w:w="60"/>
+              <w:right w:type="dxa" w:w="90"/>
+            </w:tcMar>
+          </w:tcPr>
+          <w:p>
+            <w:pPr>
+              <w:spacing w:after="0" w:line="240"/>
+              <w:jc w:val="right"/>
+            </w:pPr>
+            <w:r>
+              <w:rPr>
+                <w:rFonts w:ascii="Times New Roman" w:cs="Times New Roman" w:eastAsia="Times New Roman" w:hAnsi="Times New Roman"/>
+                <w:b w:val="false"/>
+                <w:bCs w:val="false"/>
+                <w:sz w:val="20"/>
+                <w:szCs w:val="20"/>
+              </w:rPr>
+              <w:t xml:space="preserve">1.017,04</w:t>
+            </w:r>
+          </w:p>
+        </w:tc>
+        <w:tc>
+          <w:tcPr>
+            <w:tcW w:type="dxa" w:w="2400"/>
+            <w:tcMar>
+              <w:top w:type="dxa" w:w="60"/>
+              <w:left w:type="dxa" w:w="90"/>
+              <w:bottom w:type="dxa" w:w="60"/>
+              <w:right w:type="dxa" w:w="90"/>
+            </w:tcMar>
+          </w:tcPr>
+          <w:p>
+            <w:pPr>
+              <w:spacing w:after="0" w:line="240"/>
+              <w:jc w:val="right"/>
+            </w:pPr>
+            <w:r>
+              <w:rPr>
+                <w:rFonts w:ascii="Times New Roman" w:cs="Times New Roman" w:eastAsia="Times New Roman" w:hAnsi="Times New Roman"/>
+                <w:b w:val="false"/>
+                <w:bCs w:val="false"/>
+                <w:sz w:val="20"/>
+                <w:szCs w:val="20"/>
+              </w:rPr>
+              <w:t xml:space="preserve">101,70</w:t>
             </w:r>
           </w:p>
         </w:tc>
@@ -13727,7 +14290,7 @@
       <w:tr>
         <w:tc>
           <w:tcPr>
-            <w:tcW w:type="dxa" w:w="5360"/>
+            <w:tcW w:type="dxa" w:w="4560"/>
             <w:shd w:fill="F4B183" w:color="auto" w:val="clear"/>
             <w:tcMar>
               <w:top w:type="dxa" w:w="60"/>
@@ -13755,7 +14318,7 @@
         </w:tc>
         <w:tc>
           <w:tcPr>
-            <w:tcW w:type="dxa" w:w="4000"/>
+            <w:tcW w:type="dxa" w:w="2400"/>
             <w:shd w:fill="F4B183" w:color="auto" w:val="clear"/>
             <w:tcMar>
               <w:top w:type="dxa" w:w="60"/>
@@ -13777,7 +14340,35 @@
                 <w:sz w:val="20"/>
                 <w:szCs w:val="20"/>
               </w:rPr>
-              <w:t xml:space="preserve">6.110,23</w:t>
+              <w:t xml:space="preserve">6.102,24</w:t>
+            </w:r>
+          </w:p>
+        </w:tc>
+        <w:tc>
+          <w:tcPr>
+            <w:tcW w:type="dxa" w:w="2400"/>
+            <w:shd w:fill="F4B183" w:color="auto" w:val="clear"/>
+            <w:tcMar>
+              <w:top w:type="dxa" w:w="60"/>
+              <w:left w:type="dxa" w:w="90"/>
+              <w:bottom w:type="dxa" w:w="60"/>
+              <w:right w:type="dxa" w:w="90"/>
+            </w:tcMar>
+          </w:tcPr>
+          <w:p>
+            <w:pPr>
+              <w:spacing w:after="0" w:line="240"/>
+              <w:jc w:val="right"/>
+            </w:pPr>
+            <w:r>
+              <w:rPr>
+                <w:rFonts w:ascii="Times New Roman" w:cs="Times New Roman" w:eastAsia="Times New Roman" w:hAnsi="Times New Roman"/>
+                <w:b/>
+                <w:bCs/>
+                <w:sz w:val="20"/>
+                <w:szCs w:val="20"/>
+              </w:rPr>
+              <w:t xml:space="preserve">610,22</w:t>
             </w:r>
           </w:p>
         </w:tc>
@@ -14024,7 +14615,7 @@
                 <w:sz w:val="20"/>
                 <w:szCs w:val="20"/>
               </w:rPr>
-              <w:t xml:space="preserve">Bs 98,20</w:t>
+              <w:t xml:space="preserve">Bs 99,90 (US$ 9,99)</w:t>
             </w:r>
           </w:p>
         </w:tc>
@@ -14051,7 +14642,7 @@
                 <w:sz w:val="20"/>
                 <w:szCs w:val="20"/>
               </w:rPr>
-              <w:t xml:space="preserve">Bs 98,20</w:t>
+              <w:t xml:space="preserve">Bs 99,90 (US$ 9,99)</w:t>
             </w:r>
           </w:p>
         </w:tc>
@@ -14107,7 +14698,7 @@
                 <w:sz w:val="20"/>
                 <w:szCs w:val="20"/>
               </w:rPr>
-              <w:t xml:space="preserve">Bs 3,13</w:t>
+              <w:t xml:space="preserve">Bs 3,13 (US$ 0,31)</w:t>
             </w:r>
           </w:p>
         </w:tc>
@@ -14134,7 +14725,7 @@
                 <w:sz w:val="20"/>
                 <w:szCs w:val="20"/>
               </w:rPr>
-              <w:t xml:space="preserve">Bs 45,63</w:t>
+              <w:t xml:space="preserve">Bs 45,63 (US$ 4,56)</w:t>
             </w:r>
           </w:p>
         </w:tc>
@@ -14190,7 +14781,7 @@
                 <w:sz w:val="20"/>
                 <w:szCs w:val="20"/>
               </w:rPr>
-              <w:t xml:space="preserve">Bs 95,07</w:t>
+              <w:t xml:space="preserve">Bs 96,77 (US$ 9,68)</w:t>
             </w:r>
           </w:p>
         </w:tc>
@@ -14217,7 +14808,7 @@
                 <w:sz w:val="20"/>
                 <w:szCs w:val="20"/>
               </w:rPr>
-              <w:t xml:space="preserve">Bs 52,57</w:t>
+              <w:t xml:space="preserve">Bs 54,27 (US$ 5,43)</w:t>
             </w:r>
           </w:p>
         </w:tc>
@@ -14273,7 +14864,7 @@
                 <w:sz w:val="20"/>
                 <w:szCs w:val="20"/>
               </w:rPr>
-              <w:t xml:space="preserve">Bs 3.266,66</w:t>
+              <w:t xml:space="preserve">Bs 3.260 (US$ 326)</w:t>
             </w:r>
           </w:p>
         </w:tc>
@@ -14300,7 +14891,7 @@
                 <w:sz w:val="20"/>
                 <w:szCs w:val="20"/>
               </w:rPr>
-              <w:t xml:space="preserve">Bs 3.266,66</w:t>
+              <w:t xml:space="preserve">Bs 3.260 (US$ 326)</w:t>
             </w:r>
           </w:p>
         </w:tc>
@@ -14358,7 +14949,7 @@
                 <w:sz w:val="20"/>
                 <w:szCs w:val="20"/>
               </w:rPr>
-              <w:t xml:space="preserve">35 aulas</w:t>
+              <w:t xml:space="preserve">34 aulas</w:t>
             </w:r>
           </w:p>
         </w:tc>
@@ -14386,7 +14977,7 @@
                 <w:sz w:val="20"/>
                 <w:szCs w:val="20"/>
               </w:rPr>
-              <w:t xml:space="preserve">62 aulas</w:t>
+              <w:t xml:space="preserve">61 aulas</w:t>
             </w:r>
           </w:p>
         </w:tc>
@@ -14444,7 +15035,7 @@
                 <w:sz w:val="20"/>
                 <w:szCs w:val="20"/>
               </w:rPr>
-              <w:t xml:space="preserve">Bs 3.437 al mes</w:t>
+              <w:t xml:space="preserve">Bs 3.397 al mes (US$ 340)</w:t>
             </w:r>
           </w:p>
         </w:tc>
@@ -14472,7 +15063,7 @@
                 <w:sz w:val="20"/>
                 <w:szCs w:val="20"/>
               </w:rPr>
-              <w:t xml:space="preserve">Bs 6.102 al mes</w:t>
+              <w:t xml:space="preserve">Bs 6.094 al mes (US$ 609)</w:t>
             </w:r>
           </w:p>
         </w:tc>
@@ -14491,7 +15082,7 @@
           <w:sz w:val="18"/>
           <w:szCs w:val="18"/>
         </w:rPr>
-        <w:t xml:space="preserve">Tabla 19. Punto de equilibrio. El escenario de caja refleja el primer año, con el equipo fundador aportando su trabajo; el escenario económico pleno valoriza esa mano de obra a precio de mercado.</w:t>
+        <w:t xml:space="preserve">Tabla 19. Punto de equilibrio. El escenario de caja refleja el primer año, con el equipo fundador aportando su trabajo; el escenario económico pleno valoriza esa mano de obra a precio de mercado. Los umbrales se redondean al aula entera superior: el cálculo exacto arroja 33,7 y 60,1 aulas respectivamente.</w:t>
       </w:r>
     </w:p>
     <w:p>
@@ -14510,7 +15101,7 @@
           <w:sz w:val="24"/>
           <w:szCs w:val="24"/>
         </w:rPr>
-        <w:t xml:space="preserve">La lectura es la siguiente: con 35 aulas activas el proyecto cubre todos sus desembolsos reales del primer año. Con 62 aulas cubre además el valor de mercado del trabajo del equipo, lo que significa que a partir de ese nivel el modelo podría pagar sueldos y sostenerse sin depender del aporte fundador. La meta de 80 aulas al mes 12 sitúa al proyecto por encima de ambos umbrales al cierre del primer año.</w:t>
+        <w:t xml:space="preserve">La lectura es la siguiente: con 34 aulas activas el proyecto cubre todos sus desembolsos reales del primer año. Con 61 aulas cubre además el valor de mercado del trabajo del equipo, lo que significa que a partir de ese nivel el modelo podría pagar sueldos y sostenerse sin depender del aporte fundador. La meta de 80 aulas al mes 12 sitúa al proyecto por encima de ambos umbrales al cierre del primer año.</w:t>
       </w:r>
     </w:p>
     <w:p>
@@ -15097,7 +15688,7 @@
           <w:sz w:val="24"/>
           <w:szCs w:val="24"/>
         </w:rPr>
-        <w:t xml:space="preserve">El modelo alcanza su punto de equilibrio de caja con 35 aulas activas, una meta alcanzable dentro del primer año con la capacidad comercial actual del equipo.</w:t>
+        <w:t xml:space="preserve">El modelo alcanza su punto de equilibrio de caja con 34 aulas activas (Bs 3.397 mensuales), una meta alcanzable dentro del primer año con la capacidad comercial actual del equipo.</w:t>
       </w:r>
     </w:p>
     <w:p>
@@ -15115,7 +15706,7 @@
           <w:sz w:val="24"/>
           <w:szCs w:val="24"/>
         </w:rPr>
-        <w:t xml:space="preserve">La estructura de costos es intensiva en personal, no en tecnología: el 93 % del costo variable corresponde a mano de obra de acompañamiento. Esto coincide con la evidencia internacional, donde el personal representa el 72 % del costo de programas equivalentes.</w:t>
+        <w:t xml:space="preserve">La estructura de costos es intensiva en personal, no en tecnología: el 93 % del costo variable corresponde a mano de obra de acompañamiento. Esto coincide con la evidencia internacional, donde el personal representa el 72 % del costo de programas equivalentes, con un costo de referencia de US$ 859 (Bs 8.590) por aula.</w:t>
       </w:r>
     </w:p>
     <w:p>
@@ -16060,7 +16651,7 @@
                 <w:sz w:val="20"/>
                 <w:szCs w:val="20"/>
               </w:rPr>
-              <w:t xml:space="preserve">Precio de US$ 9,99 por aula al mes</w:t>
+              <w:t xml:space="preserve">Precio de US$ 9,99 (Bs 99,90) por aula al mes</w:t>
             </w:r>
           </w:p>
         </w:tc>
@@ -16143,7 +16734,7 @@
                 <w:sz w:val="20"/>
                 <w:szCs w:val="20"/>
               </w:rPr>
-              <w:t xml:space="preserve">Costo variable de Bs 550 por aula al año</w:t>
+              <w:t xml:space="preserve">Costo variable de Bs 550 (US$ 55) por aula al año</w:t>
             </w:r>
           </w:p>
         </w:tc>
@@ -16197,7 +16788,7 @@
                 <w:sz w:val="20"/>
                 <w:szCs w:val="20"/>
               </w:rPr>
-              <w:t xml:space="preserve">Construida por componentes; referencia internacional comparable: US$ 859 por aula</w:t>
+              <w:t xml:space="preserve">Construida por componentes; referencia internacional comparable: US$ 859 (Bs 8.590) por aula</w:t>
             </w:r>
           </w:p>
         </w:tc>
@@ -16309,7 +16900,7 @@
                 <w:sz w:val="20"/>
                 <w:szCs w:val="20"/>
               </w:rPr>
-              <w:t xml:space="preserve">Tipo de cambio Bs 9,83 por USD</w:t>
+              <w:t xml:space="preserve">Tipo de cambio referencial Bs 10,00 por dólar</w:t>
             </w:r>
           </w:p>
         </w:tc>
@@ -16336,7 +16927,7 @@
                 <w:sz w:val="20"/>
                 <w:szCs w:val="20"/>
               </w:rPr>
-              <w:t xml:space="preserve">Dato oficial</w:t>
+              <w:t xml:space="preserve">Supuesto declarado</w:t>
             </w:r>
           </w:p>
         </w:tc>
@@ -16363,7 +16954,7 @@
                 <w:sz w:val="20"/>
                 <w:szCs w:val="20"/>
               </w:rPr>
-              <w:t xml:space="preserve">BCB, 17-09-2026. El mercado paralelo operaba entre Bs 10,9 y 11,9 en la misma semana</w:t>
+              <w:t xml:space="preserve">Oficial BCB al 17-09-2026: Bs 9,83. Paralelo en la misma semana: Bs 10,9 a 11,9. Se adopta Bs 10,00 como referencia conservadora y legible</w:t>
             </w:r>
           </w:p>
         </w:tc>
@@ -16392,7 +16983,7 @@
                 <w:sz w:val="20"/>
                 <w:szCs w:val="20"/>
               </w:rPr>
-              <w:t xml:space="preserve">Capital semilla de Bs 12.000 en efectivo</w:t>
+              <w:t xml:space="preserve">Capital semilla de Bs 12.000 (US$ 1.200) en efectivo</w:t>
             </w:r>
           </w:p>
         </w:tc>

</xml_diff>

<commit_message>
docs: inserta el lienzo visual del canvas en el documento Word
Agrega, al inicio de la sección 2, una reproducción en tabla del
Business Model Canvas oficial del CIEU-UAGRM (misma cuadrícula de 9
bloques que el póster físico, con campos PROYECTO y CÓDIGO), como
esquema de un vistazo antes del desarrollo detallado por bloque que ya
existía.

Co-Authored-By: Claude Sonnet 5 <noreply@anthropic.com>
</commit_message>
<xml_diff>
--- a/docs/YAIS-RED_Modelo-de-Negocio_HACKBIZ2026.docx
+++ b/docs/YAIS-RED_Modelo-de-Negocio_HACKBIZ2026.docx
@@ -565,6 +565,1023 @@
     </w:p>
     <w:p>
       <w:pPr>
+        <w:spacing w:after="120" w:before="0" w:line="360"/>
+        <w:ind w:firstLine="720"/>
+        <w:jc w:val="left"/>
+      </w:pPr>
+      <w:r>
+        <w:rPr>
+          <w:rFonts w:ascii="Times New Roman" w:cs="Times New Roman" w:eastAsia="Times New Roman" w:hAnsi="Times New Roman"/>
+          <w:b w:val="false"/>
+          <w:bCs w:val="false"/>
+          <w:i w:val="false"/>
+          <w:iCs w:val="false"/>
+          <w:sz w:val="24"/>
+          <w:szCs w:val="24"/>
+        </w:rPr>
+        <w:t xml:space="preserve">El siguiente esquema resume el lienzo completo en el mismo formato de nueve bloques del Business Model Canvas oficial del Centro de Innovación y Emprendimiento Universitario. El desarrollo de cada bloque, con su cuantificación y sus tablas de respaldo, sigue después del esquema.</w:t>
+      </w:r>
+    </w:p>
+    <w:p>
+      <w:pPr>
+        <w:spacing w:after="120"/>
+      </w:pPr>
+    </w:p>
+    <w:tbl>
+      <w:tblPr>
+        <w:tblW w:type="dxa" w:w="9360"/>
+        <w:tblBorders>
+          <w:top w:val="single" w:color="000000" w:sz="4"/>
+          <w:left w:val="single" w:color="000000" w:sz="4"/>
+          <w:bottom w:val="single" w:color="000000" w:sz="4"/>
+          <w:right w:val="single" w:color="000000" w:sz="4"/>
+          <w:insideH w:val="single" w:color="000000" w:sz="4"/>
+          <w:insideV w:val="single" w:color="000000" w:sz="4"/>
+        </w:tblBorders>
+      </w:tblPr>
+      <w:tblGrid>
+        <w:gridCol w:w="4680"/>
+        <w:gridCol w:w="4680"/>
+      </w:tblGrid>
+      <w:tr>
+        <w:tc>
+          <w:tcPr>
+            <w:tcW w:type="dxa" w:w="4680"/>
+            <w:shd w:fill="1F1A17" w:color="auto" w:val="clear"/>
+            <w:tcMar>
+              <w:top w:type="dxa" w:w="100"/>
+              <w:left w:type="dxa" w:w="150"/>
+              <w:bottom w:type="dxa" w:w="100"/>
+              <w:right w:type="dxa" w:w="150"/>
+            </w:tcMar>
+          </w:tcPr>
+          <w:p>
+            <w:pPr>
+              <w:spacing w:after="40" w:line="240"/>
+            </w:pPr>
+            <w:r>
+              <w:rPr>
+                <w:rFonts w:ascii="Times New Roman" w:cs="Times New Roman" w:eastAsia="Times New Roman" w:hAnsi="Times New Roman"/>
+                <w:b/>
+                <w:bCs/>
+                <w:color w:val="FFFFFF"/>
+                <w:sz w:val="20"/>
+                <w:szCs w:val="20"/>
+              </w:rPr>
+              <w:t xml:space="preserve">PROYECTO: </w:t>
+            </w:r>
+            <w:r>
+              <w:rPr>
+                <w:rFonts w:ascii="Times New Roman" w:cs="Times New Roman" w:eastAsia="Times New Roman" w:hAnsi="Times New Roman"/>
+                <w:color w:val="FFFFFF"/>
+                <w:sz w:val="20"/>
+                <w:szCs w:val="20"/>
+              </w:rPr>
+              <w:t xml:space="preserve">La Isla de los Acuerdos — YAIS RED</w:t>
+            </w:r>
+          </w:p>
+          <w:p>
+            <w:pPr>
+              <w:spacing w:line="240"/>
+            </w:pPr>
+            <w:r>
+              <w:rPr>
+                <w:rFonts w:ascii="Times New Roman" w:cs="Times New Roman" w:eastAsia="Times New Roman" w:hAnsi="Times New Roman"/>
+                <w:i/>
+                <w:iCs/>
+                <w:color w:val="D9D9D9"/>
+                <w:sz w:val="15"/>
+                <w:szCs w:val="15"/>
+              </w:rPr>
+              <w:t xml:space="preserve">Facultad de Ciencias Económicas y Empresariales — UAGRM · Centro de Innovación y Emprendimiento Universitario · con el apoyo de ChildFund</w:t>
+            </w:r>
+          </w:p>
+        </w:tc>
+        <w:tc>
+          <w:tcPr>
+            <w:tcW w:type="dxa" w:w="4680"/>
+            <w:shd w:fill="1F1A17" w:color="auto" w:val="clear"/>
+            <w:tcMar>
+              <w:top w:type="dxa" w:w="100"/>
+              <w:left w:type="dxa" w:w="150"/>
+              <w:bottom w:type="dxa" w:w="100"/>
+              <w:right w:type="dxa" w:w="150"/>
+            </w:tcMar>
+            <w:vAlign w:val="center"/>
+          </w:tcPr>
+          <w:p>
+            <w:pPr>
+              <w:jc w:val="right"/>
+            </w:pPr>
+            <w:r>
+              <w:rPr>
+                <w:rFonts w:ascii="Times New Roman" w:cs="Times New Roman" w:eastAsia="Times New Roman" w:hAnsi="Times New Roman"/>
+                <w:color w:val="FFFFFF"/>
+                <w:sz w:val="20"/>
+                <w:szCs w:val="20"/>
+              </w:rPr>
+              <w:t xml:space="preserve">CÓDIGO: ______________</w:t>
+            </w:r>
+          </w:p>
+        </w:tc>
+      </w:tr>
+    </w:tbl>
+    <w:p>
+      <w:pPr>
+        <w:spacing w:after="100"/>
+      </w:pPr>
+    </w:p>
+    <w:tbl>
+      <w:tblPr>
+        <w:tblW w:type="dxa" w:w="9360"/>
+        <w:tblBorders>
+          <w:top w:val="single" w:color="000000" w:sz="6"/>
+          <w:left w:val="single" w:color="000000" w:sz="6"/>
+          <w:bottom w:val="single" w:color="000000" w:sz="6"/>
+          <w:right w:val="single" w:color="000000" w:sz="6"/>
+          <w:insideH w:val="single" w:color="000000" w:sz="6"/>
+          <w:insideV w:val="single" w:color="000000" w:sz="6"/>
+        </w:tblBorders>
+      </w:tblPr>
+      <w:tblGrid>
+        <w:gridCol w:w="1660"/>
+        <w:gridCol w:w="1780"/>
+        <w:gridCol w:w="2360"/>
+        <w:gridCol w:w="1780"/>
+        <w:gridCol w:w="1780"/>
+      </w:tblGrid>
+      <w:tr>
+        <w:tc>
+          <w:tcPr>
+            <w:tcW w:type="dxa" w:w="1660"/>
+            <w:vMerge w:val="restart"/>
+            <w:shd w:fill="FFFFFF" w:color="auto" w:val="clear"/>
+            <w:tcMar>
+              <w:top w:type="dxa" w:w="90"/>
+              <w:left w:type="dxa" w:w="110"/>
+              <w:bottom w:type="dxa" w:w="90"/>
+              <w:right w:type="dxa" w:w="110"/>
+            </w:tcMar>
+            <w:vAlign w:val="top"/>
+          </w:tcPr>
+          <w:p>
+            <w:pPr>
+              <w:spacing w:after="60" w:line="240"/>
+            </w:pPr>
+            <w:r>
+              <w:rPr>
+                <w:rFonts w:ascii="Times New Roman" w:cs="Times New Roman" w:eastAsia="Times New Roman" w:hAnsi="Times New Roman"/>
+                <w:b/>
+                <w:bCs/>
+                <w:color w:val="C00000"/>
+                <w:sz w:val="17"/>
+                <w:szCs w:val="17"/>
+              </w:rPr>
+              <w:t xml:space="preserve">SOCIOS CLAVE</w:t>
+            </w:r>
+          </w:p>
+          <w:p>
+            <w:pPr>
+              <w:pStyle w:val="ListParagraph"/>
+              <w:numPr>
+                <w:ilvl w:val="0"/>
+                <w:numId w:val="2"/>
+              </w:numPr>
+              <w:spacing w:after="20" w:line="220"/>
+            </w:pPr>
+            <w:r>
+              <w:rPr>
+                <w:rFonts w:ascii="Times New Roman" w:cs="Times New Roman" w:eastAsia="Times New Roman" w:hAnsi="Times New Roman"/>
+                <w:sz w:val="14"/>
+                <w:szCs w:val="14"/>
+              </w:rPr>
+              <w:t xml:space="preserve">CEMSE / ChildFund, Visión Mundial, Save the Children, Educo</w:t>
+            </w:r>
+          </w:p>
+          <w:p>
+            <w:pPr>
+              <w:pStyle w:val="ListParagraph"/>
+              <w:numPr>
+                <w:ilvl w:val="0"/>
+                <w:numId w:val="2"/>
+              </w:numPr>
+              <w:spacing w:after="20" w:line="220"/>
+            </w:pPr>
+            <w:r>
+              <w:rPr>
+                <w:rFonts w:ascii="Times New Roman" w:cs="Times New Roman" w:eastAsia="Times New Roman" w:hAnsi="Times New Roman"/>
+                <w:sz w:val="14"/>
+                <w:szCs w:val="14"/>
+              </w:rPr>
+              <w:t xml:space="preserve">Defensoría de la Niñez y Adolescencia</w:t>
+            </w:r>
+          </w:p>
+          <w:p>
+            <w:pPr>
+              <w:pStyle w:val="ListParagraph"/>
+              <w:numPr>
+                <w:ilvl w:val="0"/>
+                <w:numId w:val="2"/>
+              </w:numPr>
+              <w:spacing w:after="20" w:line="220"/>
+            </w:pPr>
+            <w:r>
+              <w:rPr>
+                <w:rFonts w:ascii="Times New Roman" w:cs="Times New Roman" w:eastAsia="Times New Roman" w:hAnsi="Times New Roman"/>
+                <w:sz w:val="14"/>
+                <w:szCs w:val="14"/>
+              </w:rPr>
+              <w:t xml:space="preserve">Colegio de Psicólogos de Bolivia</w:t>
+            </w:r>
+          </w:p>
+          <w:p>
+            <w:pPr>
+              <w:pStyle w:val="ListParagraph"/>
+              <w:numPr>
+                <w:ilvl w:val="0"/>
+                <w:numId w:val="2"/>
+              </w:numPr>
+              <w:spacing w:after="20" w:line="220"/>
+            </w:pPr>
+            <w:r>
+              <w:rPr>
+                <w:rFonts w:ascii="Times New Roman" w:cs="Times New Roman" w:eastAsia="Times New Roman" w:hAnsi="Times New Roman"/>
+                <w:sz w:val="14"/>
+                <w:szCs w:val="14"/>
+              </w:rPr>
+              <w:t xml:space="preserve">UAGRM (FH y FICCT)</w:t>
+            </w:r>
+          </w:p>
+        </w:tc>
+        <w:tc>
+          <w:tcPr>
+            <w:tcW w:type="dxa" w:w="1780"/>
+            <w:shd w:fill="FFFFFF" w:color="auto" w:val="clear"/>
+            <w:tcMar>
+              <w:top w:type="dxa" w:w="90"/>
+              <w:left w:type="dxa" w:w="110"/>
+              <w:bottom w:type="dxa" w:w="90"/>
+              <w:right w:type="dxa" w:w="110"/>
+            </w:tcMar>
+            <w:vAlign w:val="top"/>
+          </w:tcPr>
+          <w:p>
+            <w:pPr>
+              <w:spacing w:after="60" w:line="240"/>
+            </w:pPr>
+            <w:r>
+              <w:rPr>
+                <w:rFonts w:ascii="Times New Roman" w:cs="Times New Roman" w:eastAsia="Times New Roman" w:hAnsi="Times New Roman"/>
+                <w:b/>
+                <w:bCs/>
+                <w:color w:val="C00000"/>
+                <w:sz w:val="17"/>
+                <w:szCs w:val="17"/>
+              </w:rPr>
+              <w:t xml:space="preserve">ACTIVIDADES CLAVE</w:t>
+            </w:r>
+          </w:p>
+          <w:p>
+            <w:pPr>
+              <w:pStyle w:val="ListParagraph"/>
+              <w:numPr>
+                <w:ilvl w:val="0"/>
+                <w:numId w:val="2"/>
+              </w:numPr>
+              <w:spacing w:after="20" w:line="220"/>
+            </w:pPr>
+            <w:r>
+              <w:rPr>
+                <w:rFonts w:ascii="Times New Roman" w:cs="Times New Roman" w:eastAsia="Times New Roman" w:hAnsi="Times New Roman"/>
+                <w:sz w:val="14"/>
+                <w:szCs w:val="14"/>
+              </w:rPr>
+              <w:t xml:space="preserve">Diseño pedagógico y revisión psicológica</w:t>
+            </w:r>
+          </w:p>
+          <w:p>
+            <w:pPr>
+              <w:pStyle w:val="ListParagraph"/>
+              <w:numPr>
+                <w:ilvl w:val="0"/>
+                <w:numId w:val="2"/>
+              </w:numPr>
+              <w:spacing w:after="20" w:line="220"/>
+            </w:pPr>
+            <w:r>
+              <w:rPr>
+                <w:rFonts w:ascii="Times New Roman" w:cs="Times New Roman" w:eastAsia="Times New Roman" w:hAnsi="Times New Roman"/>
+                <w:sz w:val="14"/>
+                <w:szCs w:val="14"/>
+              </w:rPr>
+              <w:t xml:space="preserve">Desarrollo de la experiencia web 3D</w:t>
+            </w:r>
+          </w:p>
+          <w:p>
+            <w:pPr>
+              <w:pStyle w:val="ListParagraph"/>
+              <w:numPr>
+                <w:ilvl w:val="0"/>
+                <w:numId w:val="2"/>
+              </w:numPr>
+              <w:spacing w:after="20" w:line="220"/>
+            </w:pPr>
+            <w:r>
+              <w:rPr>
+                <w:rFonts w:ascii="Times New Roman" w:cs="Times New Roman" w:eastAsia="Times New Roman" w:hAnsi="Times New Roman"/>
+                <w:sz w:val="14"/>
+                <w:szCs w:val="14"/>
+              </w:rPr>
+              <w:t xml:space="preserve">Capacitación de facilitadores</w:t>
+            </w:r>
+          </w:p>
+          <w:p>
+            <w:pPr>
+              <w:pStyle w:val="ListParagraph"/>
+              <w:numPr>
+                <w:ilvl w:val="0"/>
+                <w:numId w:val="2"/>
+              </w:numPr>
+              <w:spacing w:after="20" w:line="220"/>
+            </w:pPr>
+            <w:r>
+              <w:rPr>
+                <w:rFonts w:ascii="Times New Roman" w:cs="Times New Roman" w:eastAsia="Times New Roman" w:hAnsi="Times New Roman"/>
+                <w:sz w:val="14"/>
+                <w:szCs w:val="14"/>
+              </w:rPr>
+              <w:t xml:space="preserve">Alianzas institucionales</w:t>
+            </w:r>
+          </w:p>
+        </w:tc>
+        <w:tc>
+          <w:tcPr>
+            <w:tcW w:type="dxa" w:w="2360"/>
+            <w:vMerge w:val="restart"/>
+            <w:shd w:fill="FBEDEC" w:color="auto" w:val="clear"/>
+            <w:tcMar>
+              <w:top w:type="dxa" w:w="90"/>
+              <w:left w:type="dxa" w:w="110"/>
+              <w:bottom w:type="dxa" w:w="90"/>
+              <w:right w:type="dxa" w:w="110"/>
+            </w:tcMar>
+            <w:vAlign w:val="top"/>
+          </w:tcPr>
+          <w:p>
+            <w:pPr>
+              <w:spacing w:after="60" w:line="240"/>
+            </w:pPr>
+            <w:r>
+              <w:rPr>
+                <w:rFonts w:ascii="Times New Roman" w:cs="Times New Roman" w:eastAsia="Times New Roman" w:hAnsi="Times New Roman"/>
+                <w:b/>
+                <w:bCs/>
+                <w:color w:val="C00000"/>
+                <w:sz w:val="17"/>
+                <w:szCs w:val="17"/>
+              </w:rPr>
+              <w:t xml:space="preserve">PROPUESTA DE VALOR</w:t>
+            </w:r>
+          </w:p>
+          <w:p>
+            <w:pPr>
+              <w:pStyle w:val="ListParagraph"/>
+              <w:numPr>
+                <w:ilvl w:val="0"/>
+                <w:numId w:val="2"/>
+              </w:numPr>
+              <w:spacing w:after="20" w:line="220"/>
+            </w:pPr>
+            <w:r>
+              <w:rPr>
+                <w:rFonts w:ascii="Times New Roman" w:cs="Times New Roman" w:eastAsia="Times New Roman" w:hAnsi="Times New Roman"/>
+                <w:sz w:val="14"/>
+                <w:szCs w:val="14"/>
+              </w:rPr>
+              <w:t xml:space="preserve">La Isla de los Acuerdos: experiencia web 3D de prevención primaria para niñas y niños de 6 a 12 años</w:t>
+            </w:r>
+          </w:p>
+          <w:p>
+            <w:pPr>
+              <w:pStyle w:val="ListParagraph"/>
+              <w:numPr>
+                <w:ilvl w:val="0"/>
+                <w:numId w:val="2"/>
+              </w:numPr>
+              <w:spacing w:after="20" w:line="220"/>
+            </w:pPr>
+            <w:r>
+              <w:rPr>
+                <w:rFonts w:ascii="Times New Roman" w:cs="Times New Roman" w:eastAsia="Times New Roman" w:hAnsi="Times New Roman"/>
+                <w:sz w:val="14"/>
+                <w:szCs w:val="14"/>
+              </w:rPr>
+              <w:t xml:space="preserve">Programa acompañado: 4 episodios + capacitación + panel del facilitador + protocolo de derivación</w:t>
+            </w:r>
+          </w:p>
+          <w:p>
+            <w:pPr>
+              <w:pStyle w:val="ListParagraph"/>
+              <w:numPr>
+                <w:ilvl w:val="0"/>
+                <w:numId w:val="2"/>
+              </w:numPr>
+              <w:spacing w:after="20" w:line="220"/>
+            </w:pPr>
+            <w:r>
+              <w:rPr>
+                <w:rFonts w:ascii="Times New Roman" w:cs="Times New Roman" w:eastAsia="Times New Roman" w:hAnsi="Times New Roman"/>
+                <w:sz w:val="14"/>
+                <w:szCs w:val="14"/>
+              </w:rPr>
+              <w:t xml:space="preserve">No diagnostica, no chatea, no guarda relatos de menores</w:t>
+            </w:r>
+          </w:p>
+        </w:tc>
+        <w:tc>
+          <w:tcPr>
+            <w:tcW w:type="dxa" w:w="1780"/>
+            <w:shd w:fill="FFFFFF" w:color="auto" w:val="clear"/>
+            <w:tcMar>
+              <w:top w:type="dxa" w:w="90"/>
+              <w:left w:type="dxa" w:w="110"/>
+              <w:bottom w:type="dxa" w:w="90"/>
+              <w:right w:type="dxa" w:w="110"/>
+            </w:tcMar>
+            <w:vAlign w:val="top"/>
+          </w:tcPr>
+          <w:p>
+            <w:pPr>
+              <w:spacing w:after="60" w:line="240"/>
+            </w:pPr>
+            <w:r>
+              <w:rPr>
+                <w:rFonts w:ascii="Times New Roman" w:cs="Times New Roman" w:eastAsia="Times New Roman" w:hAnsi="Times New Roman"/>
+                <w:b/>
+                <w:bCs/>
+                <w:color w:val="C00000"/>
+                <w:sz w:val="17"/>
+                <w:szCs w:val="17"/>
+              </w:rPr>
+              <w:t xml:space="preserve">RELACIONES CON EL CLIENTE</w:t>
+            </w:r>
+          </w:p>
+          <w:p>
+            <w:pPr>
+              <w:pStyle w:val="ListParagraph"/>
+              <w:numPr>
+                <w:ilvl w:val="0"/>
+                <w:numId w:val="2"/>
+              </w:numPr>
+              <w:spacing w:after="20" w:line="220"/>
+            </w:pPr>
+            <w:r>
+              <w:rPr>
+                <w:rFonts w:ascii="Times New Roman" w:cs="Times New Roman" w:eastAsia="Times New Roman" w:hAnsi="Times New Roman"/>
+                <w:sz w:val="14"/>
+                <w:szCs w:val="14"/>
+              </w:rPr>
+              <w:t xml:space="preserve">Programa acompañado, soporte continuo al docente</w:t>
+            </w:r>
+          </w:p>
+          <w:p>
+            <w:pPr>
+              <w:pStyle w:val="ListParagraph"/>
+              <w:numPr>
+                <w:ilvl w:val="0"/>
+                <w:numId w:val="2"/>
+              </w:numPr>
+              <w:spacing w:after="20" w:line="220"/>
+            </w:pPr>
+            <w:r>
+              <w:rPr>
+                <w:rFonts w:ascii="Times New Roman" w:cs="Times New Roman" w:eastAsia="Times New Roman" w:hAnsi="Times New Roman"/>
+                <w:sz w:val="14"/>
+                <w:szCs w:val="14"/>
+              </w:rPr>
+              <w:t xml:space="preserve">Consentimiento institucional del colegio (aviso + opt-out)</w:t>
+            </w:r>
+          </w:p>
+        </w:tc>
+        <w:tc>
+          <w:tcPr>
+            <w:tcW w:type="dxa" w:w="1780"/>
+            <w:vMerge w:val="restart"/>
+            <w:shd w:fill="FFFFFF" w:color="auto" w:val="clear"/>
+            <w:tcMar>
+              <w:top w:type="dxa" w:w="90"/>
+              <w:left w:type="dxa" w:w="110"/>
+              <w:bottom w:type="dxa" w:w="90"/>
+              <w:right w:type="dxa" w:w="110"/>
+            </w:tcMar>
+            <w:vAlign w:val="top"/>
+          </w:tcPr>
+          <w:p>
+            <w:pPr>
+              <w:spacing w:after="60" w:line="240"/>
+            </w:pPr>
+            <w:r>
+              <w:rPr>
+                <w:rFonts w:ascii="Times New Roman" w:cs="Times New Roman" w:eastAsia="Times New Roman" w:hAnsi="Times New Roman"/>
+                <w:b/>
+                <w:bCs/>
+                <w:color w:val="C00000"/>
+                <w:sz w:val="17"/>
+                <w:szCs w:val="17"/>
+              </w:rPr>
+              <w:t xml:space="preserve">SEGMENTOS DE CLIENTES</w:t>
+            </w:r>
+          </w:p>
+          <w:p>
+            <w:pPr>
+              <w:pStyle w:val="ListParagraph"/>
+              <w:numPr>
+                <w:ilvl w:val="0"/>
+                <w:numId w:val="2"/>
+              </w:numPr>
+              <w:spacing w:after="20" w:line="220"/>
+            </w:pPr>
+            <w:r>
+              <w:rPr>
+                <w:rFonts w:ascii="Times New Roman" w:cs="Times New Roman" w:eastAsia="Times New Roman" w:hAnsi="Times New Roman"/>
+                <w:sz w:val="14"/>
+                <w:szCs w:val="14"/>
+              </w:rPr>
+              <w:t xml:space="preserve">Colegios privados y de convenio de Santa Cruz</w:t>
+            </w:r>
+          </w:p>
+          <w:p>
+            <w:pPr>
+              <w:pStyle w:val="ListParagraph"/>
+              <w:numPr>
+                <w:ilvl w:val="0"/>
+                <w:numId w:val="2"/>
+              </w:numPr>
+              <w:spacing w:after="20" w:line="220"/>
+            </w:pPr>
+            <w:r>
+              <w:rPr>
+                <w:rFonts w:ascii="Times New Roman" w:cs="Times New Roman" w:eastAsia="Times New Roman" w:hAnsi="Times New Roman"/>
+                <w:sz w:val="14"/>
+                <w:szCs w:val="14"/>
+              </w:rPr>
+              <w:t xml:space="preserve">ONG con programa escolar de protección</w:t>
+            </w:r>
+          </w:p>
+          <w:p>
+            <w:pPr>
+              <w:pStyle w:val="ListParagraph"/>
+              <w:numPr>
+                <w:ilvl w:val="0"/>
+                <w:numId w:val="2"/>
+              </w:numPr>
+              <w:spacing w:after="20" w:line="220"/>
+            </w:pPr>
+            <w:r>
+              <w:rPr>
+                <w:rFonts w:ascii="Times New Roman" w:cs="Times New Roman" w:eastAsia="Times New Roman" w:hAnsi="Times New Roman"/>
+                <w:sz w:val="14"/>
+                <w:szCs w:val="14"/>
+              </w:rPr>
+              <w:t xml:space="preserve">Empresas con responsabilidad social</w:t>
+            </w:r>
+          </w:p>
+          <w:p>
+            <w:pPr>
+              <w:pStyle w:val="ListParagraph"/>
+              <w:numPr>
+                <w:ilvl w:val="0"/>
+                <w:numId w:val="2"/>
+              </w:numPr>
+              <w:spacing w:after="20" w:line="220"/>
+            </w:pPr>
+            <w:r>
+              <w:rPr>
+                <w:rFonts w:ascii="Times New Roman" w:cs="Times New Roman" w:eastAsia="Times New Roman" w:hAnsi="Times New Roman"/>
+                <w:sz w:val="14"/>
+                <w:szCs w:val="14"/>
+              </w:rPr>
+              <w:t xml:space="preserve">Municipio / DNA (a partir del año 2)</w:t>
+            </w:r>
+          </w:p>
+        </w:tc>
+      </w:tr>
+      <w:tr>
+        <w:tc>
+          <w:tcPr>
+            <w:vMerge w:val="continue"/>
+          </w:tcPr>
+          <w:p/>
+        </w:tc>
+        <w:tc>
+          <w:tcPr>
+            <w:tcW w:type="dxa" w:w="1780"/>
+            <w:vMerge w:val="restart"/>
+            <w:shd w:fill="FFFFFF" w:color="auto" w:val="clear"/>
+            <w:tcMar>
+              <w:top w:type="dxa" w:w="90"/>
+              <w:left w:type="dxa" w:w="110"/>
+              <w:bottom w:type="dxa" w:w="90"/>
+              <w:right w:type="dxa" w:w="110"/>
+            </w:tcMar>
+            <w:vAlign w:val="top"/>
+          </w:tcPr>
+          <w:p>
+            <w:pPr>
+              <w:spacing w:after="60" w:line="240"/>
+            </w:pPr>
+            <w:r>
+              <w:rPr>
+                <w:rFonts w:ascii="Times New Roman" w:cs="Times New Roman" w:eastAsia="Times New Roman" w:hAnsi="Times New Roman"/>
+                <w:b/>
+                <w:bCs/>
+                <w:color w:val="C00000"/>
+                <w:sz w:val="17"/>
+                <w:szCs w:val="17"/>
+              </w:rPr>
+              <w:t xml:space="preserve">RECURSOS CLAVE</w:t>
+            </w:r>
+          </w:p>
+          <w:p>
+            <w:pPr>
+              <w:pStyle w:val="ListParagraph"/>
+              <w:numPr>
+                <w:ilvl w:val="0"/>
+                <w:numId w:val="2"/>
+              </w:numPr>
+              <w:spacing w:after="20" w:line="220"/>
+            </w:pPr>
+            <w:r>
+              <w:rPr>
+                <w:rFonts w:ascii="Times New Roman" w:cs="Times New Roman" w:eastAsia="Times New Roman" w:hAnsi="Times New Roman"/>
+                <w:sz w:val="14"/>
+                <w:szCs w:val="14"/>
+              </w:rPr>
+              <w:t xml:space="preserve">Equipo fundador: Arianna, Gabriel, Diego y Mauricio</w:t>
+            </w:r>
+          </w:p>
+          <w:p>
+            <w:pPr>
+              <w:pStyle w:val="ListParagraph"/>
+              <w:numPr>
+                <w:ilvl w:val="0"/>
+                <w:numId w:val="2"/>
+              </w:numPr>
+              <w:spacing w:after="20" w:line="220"/>
+            </w:pPr>
+            <w:r>
+              <w:rPr>
+                <w:rFonts w:ascii="Times New Roman" w:cs="Times New Roman" w:eastAsia="Times New Roman" w:hAnsi="Times New Roman"/>
+                <w:sz w:val="14"/>
+                <w:szCs w:val="14"/>
+              </w:rPr>
+              <w:t xml:space="preserve">Blender, React + React Three Fiber, Supabase</w:t>
+            </w:r>
+          </w:p>
+          <w:p>
+            <w:pPr>
+              <w:pStyle w:val="ListParagraph"/>
+              <w:numPr>
+                <w:ilvl w:val="0"/>
+                <w:numId w:val="2"/>
+              </w:numPr>
+              <w:spacing w:after="20" w:line="220"/>
+            </w:pPr>
+            <w:r>
+              <w:rPr>
+                <w:rFonts w:ascii="Times New Roman" w:cs="Times New Roman" w:eastAsia="Times New Roman" w:hAnsi="Times New Roman"/>
+                <w:sz w:val="14"/>
+                <w:szCs w:val="14"/>
+              </w:rPr>
+              <w:t xml:space="preserve">Contenido propio y protocolo de derivación boliviano</w:t>
+            </w:r>
+          </w:p>
+        </w:tc>
+        <w:tc>
+          <w:tcPr>
+            <w:vMerge w:val="continue"/>
+          </w:tcPr>
+          <w:p/>
+        </w:tc>
+        <w:tc>
+          <w:tcPr>
+            <w:tcW w:type="dxa" w:w="1780"/>
+            <w:vMerge w:val="restart"/>
+            <w:shd w:fill="FFFFFF" w:color="auto" w:val="clear"/>
+            <w:tcMar>
+              <w:top w:type="dxa" w:w="90"/>
+              <w:left w:type="dxa" w:w="110"/>
+              <w:bottom w:type="dxa" w:w="90"/>
+              <w:right w:type="dxa" w:w="110"/>
+            </w:tcMar>
+            <w:vAlign w:val="top"/>
+          </w:tcPr>
+          <w:p>
+            <w:pPr>
+              <w:spacing w:after="60" w:line="240"/>
+            </w:pPr>
+            <w:r>
+              <w:rPr>
+                <w:rFonts w:ascii="Times New Roman" w:cs="Times New Roman" w:eastAsia="Times New Roman" w:hAnsi="Times New Roman"/>
+                <w:b/>
+                <w:bCs/>
+                <w:color w:val="C00000"/>
+                <w:sz w:val="17"/>
+                <w:szCs w:val="17"/>
+              </w:rPr>
+              <w:t xml:space="preserve">CANALES</w:t>
+            </w:r>
+          </w:p>
+          <w:p>
+            <w:pPr>
+              <w:pStyle w:val="ListParagraph"/>
+              <w:numPr>
+                <w:ilvl w:val="0"/>
+                <w:numId w:val="2"/>
+              </w:numPr>
+              <w:spacing w:after="20" w:line="220"/>
+            </w:pPr>
+            <w:r>
+              <w:rPr>
+                <w:rFonts w:ascii="Times New Roman" w:cs="Times New Roman" w:eastAsia="Times New Roman" w:hAnsi="Times New Roman"/>
+                <w:sz w:val="14"/>
+                <w:szCs w:val="14"/>
+              </w:rPr>
+              <w:t xml:space="preserve">Venta directa a redes de colegios</w:t>
+            </w:r>
+          </w:p>
+          <w:p>
+            <w:pPr>
+              <w:pStyle w:val="ListParagraph"/>
+              <w:numPr>
+                <w:ilvl w:val="0"/>
+                <w:numId w:val="2"/>
+              </w:numPr>
+              <w:spacing w:after="20" w:line="220"/>
+            </w:pPr>
+            <w:r>
+              <w:rPr>
+                <w:rFonts w:ascii="Times New Roman" w:cs="Times New Roman" w:eastAsia="Times New Roman" w:hAnsi="Times New Roman"/>
+                <w:sz w:val="14"/>
+                <w:szCs w:val="14"/>
+              </w:rPr>
+              <w:t xml:space="preserve">Alianza con ONG en escuelas fiscales</w:t>
+            </w:r>
+          </w:p>
+          <w:p>
+            <w:pPr>
+              <w:pStyle w:val="ListParagraph"/>
+              <w:numPr>
+                <w:ilvl w:val="0"/>
+                <w:numId w:val="2"/>
+              </w:numPr>
+              <w:spacing w:after="20" w:line="220"/>
+            </w:pPr>
+            <w:r>
+              <w:rPr>
+                <w:rFonts w:ascii="Times New Roman" w:cs="Times New Roman" w:eastAsia="Times New Roman" w:hAnsi="Times New Roman"/>
+                <w:sz w:val="14"/>
+                <w:szCs w:val="14"/>
+              </w:rPr>
+              <w:t xml:space="preserve">Programa de aliados en salud, sin comisión por referido</w:t>
+            </w:r>
+          </w:p>
+        </w:tc>
+        <w:tc>
+          <w:tcPr>
+            <w:vMerge w:val="continue"/>
+          </w:tcPr>
+          <w:p/>
+        </w:tc>
+      </w:tr>
+      <w:tr>
+        <w:tc>
+          <w:tcPr>
+            <w:vMerge w:val="continue"/>
+          </w:tcPr>
+          <w:p/>
+        </w:tc>
+        <w:tc>
+          <w:tcPr>
+            <w:vMerge w:val="continue"/>
+          </w:tcPr>
+          <w:p/>
+        </w:tc>
+        <w:tc>
+          <w:tcPr>
+            <w:vMerge w:val="continue"/>
+          </w:tcPr>
+          <w:p/>
+        </w:tc>
+        <w:tc>
+          <w:tcPr>
+            <w:vMerge w:val="continue"/>
+          </w:tcPr>
+          <w:p/>
+        </w:tc>
+        <w:tc>
+          <w:tcPr>
+            <w:vMerge w:val="continue"/>
+          </w:tcPr>
+          <w:p/>
+        </w:tc>
+      </w:tr>
+      <w:tr>
+        <w:tc>
+          <w:tcPr>
+            <w:tcW w:type="dxa" w:w="5800"/>
+            <w:gridSpan w:val="3"/>
+            <w:shd w:fill="F2F2F2" w:color="auto" w:val="clear"/>
+            <w:tcMar>
+              <w:top w:type="dxa" w:w="90"/>
+              <w:left w:type="dxa" w:w="110"/>
+              <w:bottom w:type="dxa" w:w="90"/>
+              <w:right w:type="dxa" w:w="110"/>
+            </w:tcMar>
+            <w:vAlign w:val="top"/>
+          </w:tcPr>
+          <w:p>
+            <w:pPr>
+              <w:spacing w:after="60" w:line="240"/>
+            </w:pPr>
+            <w:r>
+              <w:rPr>
+                <w:rFonts w:ascii="Times New Roman" w:cs="Times New Roman" w:eastAsia="Times New Roman" w:hAnsi="Times New Roman"/>
+                <w:b/>
+                <w:bCs/>
+                <w:color w:val="C00000"/>
+                <w:sz w:val="17"/>
+                <w:szCs w:val="17"/>
+              </w:rPr>
+              <w:t xml:space="preserve">ESTRUCTURA DE COSTOS</w:t>
+            </w:r>
+          </w:p>
+          <w:p>
+            <w:pPr>
+              <w:pStyle w:val="ListParagraph"/>
+              <w:numPr>
+                <w:ilvl w:val="0"/>
+                <w:numId w:val="2"/>
+              </w:numPr>
+              <w:spacing w:after="20" w:line="220"/>
+            </w:pPr>
+            <w:r>
+              <w:rPr>
+                <w:rFonts w:ascii="Times New Roman" w:cs="Times New Roman" w:eastAsia="Times New Roman" w:hAnsi="Times New Roman"/>
+                <w:sz w:val="14"/>
+                <w:szCs w:val="14"/>
+              </w:rPr>
+              <w:t xml:space="preserve">Equipo fundador: Bs 0 (sin nómina)</w:t>
+            </w:r>
+          </w:p>
+          <w:p>
+            <w:pPr>
+              <w:pStyle w:val="ListParagraph"/>
+              <w:numPr>
+                <w:ilvl w:val="0"/>
+                <w:numId w:val="2"/>
+              </w:numPr>
+              <w:spacing w:after="20" w:line="220"/>
+            </w:pPr>
+            <w:r>
+              <w:rPr>
+                <w:rFonts w:ascii="Times New Roman" w:cs="Times New Roman" w:eastAsia="Times New Roman" w:hAnsi="Times New Roman"/>
+                <w:sz w:val="14"/>
+                <w:szCs w:val="14"/>
+              </w:rPr>
+              <w:t xml:space="preserve">Capital semilla HACKBIZ: Bs 12.000 (US$ 1.200)</w:t>
+            </w:r>
+          </w:p>
+          <w:p>
+            <w:pPr>
+              <w:pStyle w:val="ListParagraph"/>
+              <w:numPr>
+                <w:ilvl w:val="0"/>
+                <w:numId w:val="2"/>
+              </w:numPr>
+              <w:spacing w:after="20" w:line="220"/>
+            </w:pPr>
+            <w:r>
+              <w:rPr>
+                <w:rFonts w:ascii="Times New Roman" w:cs="Times New Roman" w:eastAsia="Times New Roman" w:hAnsi="Times New Roman"/>
+                <w:sz w:val="14"/>
+                <w:szCs w:val="14"/>
+              </w:rPr>
+              <w:t xml:space="preserve">Costo variable ≈ Bs 45,63 (US$ 4,56) por aula al mes</w:t>
+            </w:r>
+          </w:p>
+        </w:tc>
+        <w:tc>
+          <w:tcPr>
+            <w:tcW w:type="dxa" w:w="3560"/>
+            <w:gridSpan w:val="2"/>
+            <w:shd w:fill="F2F2F2" w:color="auto" w:val="clear"/>
+            <w:tcMar>
+              <w:top w:type="dxa" w:w="90"/>
+              <w:left w:type="dxa" w:w="110"/>
+              <w:bottom w:type="dxa" w:w="90"/>
+              <w:right w:type="dxa" w:w="110"/>
+            </w:tcMar>
+            <w:vAlign w:val="top"/>
+          </w:tcPr>
+          <w:p>
+            <w:pPr>
+              <w:spacing w:after="60" w:line="240"/>
+            </w:pPr>
+            <w:r>
+              <w:rPr>
+                <w:rFonts w:ascii="Times New Roman" w:cs="Times New Roman" w:eastAsia="Times New Roman" w:hAnsi="Times New Roman"/>
+                <w:b/>
+                <w:bCs/>
+                <w:color w:val="C00000"/>
+                <w:sz w:val="17"/>
+                <w:szCs w:val="17"/>
+              </w:rPr>
+              <w:t xml:space="preserve">FUENTES DE INGRESOS</w:t>
+            </w:r>
+          </w:p>
+          <w:p>
+            <w:pPr>
+              <w:pStyle w:val="ListParagraph"/>
+              <w:numPr>
+                <w:ilvl w:val="0"/>
+                <w:numId w:val="2"/>
+              </w:numPr>
+              <w:spacing w:after="20" w:line="220"/>
+            </w:pPr>
+            <w:r>
+              <w:rPr>
+                <w:rFonts w:ascii="Times New Roman" w:cs="Times New Roman" w:eastAsia="Times New Roman" w:hAnsi="Times New Roman"/>
+                <w:sz w:val="14"/>
+                <w:szCs w:val="14"/>
+              </w:rPr>
+              <w:t xml:space="preserve">Licencia por aula: US$ 9,99 (Bs 99,90) al mes</w:t>
+            </w:r>
+          </w:p>
+          <w:p>
+            <w:pPr>
+              <w:pStyle w:val="ListParagraph"/>
+              <w:numPr>
+                <w:ilvl w:val="0"/>
+                <w:numId w:val="2"/>
+              </w:numPr>
+              <w:spacing w:after="20" w:line="220"/>
+            </w:pPr>
+            <w:r>
+              <w:rPr>
+                <w:rFonts w:ascii="Times New Roman" w:cs="Times New Roman" w:eastAsia="Times New Roman" w:hAnsi="Times New Roman"/>
+                <w:sz w:val="14"/>
+                <w:szCs w:val="14"/>
+              </w:rPr>
+              <w:t xml:space="preserve">Becas vía ONG para escuelas fiscales</w:t>
+            </w:r>
+          </w:p>
+          <w:p>
+            <w:pPr>
+              <w:pStyle w:val="ListParagraph"/>
+              <w:numPr>
+                <w:ilvl w:val="0"/>
+                <w:numId w:val="2"/>
+              </w:numPr>
+              <w:spacing w:after="20" w:line="220"/>
+            </w:pPr>
+            <w:r>
+              <w:rPr>
+                <w:rFonts w:ascii="Times New Roman" w:cs="Times New Roman" w:eastAsia="Times New Roman" w:hAnsi="Times New Roman"/>
+                <w:sz w:val="14"/>
+                <w:szCs w:val="14"/>
+              </w:rPr>
+              <w:t xml:space="preserve">Capacitación, patrocinio RSE</w:t>
+            </w:r>
+          </w:p>
+          <w:p>
+            <w:pPr>
+              <w:pStyle w:val="ListParagraph"/>
+              <w:numPr>
+                <w:ilvl w:val="0"/>
+                <w:numId w:val="2"/>
+              </w:numPr>
+              <w:spacing w:after="20" w:line="220"/>
+            </w:pPr>
+            <w:r>
+              <w:rPr>
+                <w:rFonts w:ascii="Times New Roman" w:cs="Times New Roman" w:eastAsia="Times New Roman" w:hAnsi="Times New Roman"/>
+                <w:sz w:val="14"/>
+                <w:szCs w:val="14"/>
+              </w:rPr>
+              <w:t xml:space="preserve">Subvenciones: solo desarrollo y evaluación</w:t>
+            </w:r>
+          </w:p>
+        </w:tc>
+      </w:tr>
+    </w:tbl>
+    <w:p>
+      <w:r>
+        <w:br w:type="page"/>
+      </w:r>
+    </w:p>
+    <w:p>
+      <w:pPr>
         <w:pStyle w:val="Heading2"/>
         <w:spacing w:after="160" w:before="280" w:line="360"/>
       </w:pPr>
@@ -1448,7 +2465,7 @@
         <w:pStyle w:val="ListParagraph"/>
         <w:numPr>
           <w:ilvl w:val="0"/>
-          <w:numId w:val="2"/>
+          <w:numId w:val="3"/>
         </w:numPr>
         <w:spacing w:after="80" w:line="360"/>
       </w:pPr>
@@ -1466,7 +2483,7 @@
         <w:pStyle w:val="ListParagraph"/>
         <w:numPr>
           <w:ilvl w:val="0"/>
-          <w:numId w:val="2"/>
+          <w:numId w:val="3"/>
         </w:numPr>
         <w:spacing w:after="80" w:line="360"/>
       </w:pPr>
@@ -1484,7 +2501,7 @@
         <w:pStyle w:val="ListParagraph"/>
         <w:numPr>
           <w:ilvl w:val="0"/>
-          <w:numId w:val="2"/>
+          <w:numId w:val="3"/>
         </w:numPr>
         <w:spacing w:after="80" w:line="360"/>
       </w:pPr>
@@ -1502,7 +2519,7 @@
         <w:pStyle w:val="ListParagraph"/>
         <w:numPr>
           <w:ilvl w:val="0"/>
-          <w:numId w:val="2"/>
+          <w:numId w:val="3"/>
         </w:numPr>
         <w:spacing w:after="80" w:line="360"/>
       </w:pPr>
@@ -5601,7 +6618,7 @@
         <w:pStyle w:val="ListParagraph"/>
         <w:numPr>
           <w:ilvl w:val="0"/>
-          <w:numId w:val="2"/>
+          <w:numId w:val="3"/>
         </w:numPr>
         <w:spacing w:after="80" w:line="360"/>
       </w:pPr>
@@ -5619,7 +6636,7 @@
         <w:pStyle w:val="ListParagraph"/>
         <w:numPr>
           <w:ilvl w:val="0"/>
-          <w:numId w:val="2"/>
+          <w:numId w:val="3"/>
         </w:numPr>
         <w:spacing w:after="80" w:line="360"/>
       </w:pPr>
@@ -5637,7 +6654,7 @@
         <w:pStyle w:val="ListParagraph"/>
         <w:numPr>
           <w:ilvl w:val="0"/>
-          <w:numId w:val="2"/>
+          <w:numId w:val="3"/>
         </w:numPr>
         <w:spacing w:after="80" w:line="360"/>
       </w:pPr>
@@ -5655,7 +6672,7 @@
         <w:pStyle w:val="ListParagraph"/>
         <w:numPr>
           <w:ilvl w:val="0"/>
-          <w:numId w:val="2"/>
+          <w:numId w:val="3"/>
         </w:numPr>
         <w:spacing w:after="80" w:line="360"/>
       </w:pPr>
@@ -7254,7 +8271,7 @@
         <w:pStyle w:val="ListParagraph"/>
         <w:numPr>
           <w:ilvl w:val="0"/>
-          <w:numId w:val="2"/>
+          <w:numId w:val="3"/>
         </w:numPr>
         <w:spacing w:after="80" w:line="360"/>
       </w:pPr>
@@ -7272,7 +8289,7 @@
         <w:pStyle w:val="ListParagraph"/>
         <w:numPr>
           <w:ilvl w:val="0"/>
-          <w:numId w:val="2"/>
+          <w:numId w:val="3"/>
         </w:numPr>
         <w:spacing w:after="80" w:line="360"/>
       </w:pPr>
@@ -7290,7 +8307,7 @@
         <w:pStyle w:val="ListParagraph"/>
         <w:numPr>
           <w:ilvl w:val="0"/>
-          <w:numId w:val="2"/>
+          <w:numId w:val="3"/>
         </w:numPr>
         <w:spacing w:after="80" w:line="360"/>
       </w:pPr>
@@ -7308,7 +8325,7 @@
         <w:pStyle w:val="ListParagraph"/>
         <w:numPr>
           <w:ilvl w:val="0"/>
-          <w:numId w:val="2"/>
+          <w:numId w:val="3"/>
         </w:numPr>
         <w:spacing w:after="80" w:line="360"/>
       </w:pPr>
@@ -7326,7 +8343,7 @@
         <w:pStyle w:val="ListParagraph"/>
         <w:numPr>
           <w:ilvl w:val="0"/>
-          <w:numId w:val="2"/>
+          <w:numId w:val="3"/>
         </w:numPr>
         <w:spacing w:after="80" w:line="360"/>
       </w:pPr>
@@ -15660,7 +16677,7 @@
         <w:pStyle w:val="ListParagraph"/>
         <w:numPr>
           <w:ilvl w:val="0"/>
-          <w:numId w:val="2"/>
+          <w:numId w:val="3"/>
         </w:numPr>
         <w:spacing w:after="80" w:line="360"/>
       </w:pPr>
@@ -15678,7 +16695,7 @@
         <w:pStyle w:val="ListParagraph"/>
         <w:numPr>
           <w:ilvl w:val="0"/>
-          <w:numId w:val="2"/>
+          <w:numId w:val="3"/>
         </w:numPr>
         <w:spacing w:after="80" w:line="360"/>
       </w:pPr>
@@ -15696,7 +16713,7 @@
         <w:pStyle w:val="ListParagraph"/>
         <w:numPr>
           <w:ilvl w:val="0"/>
-          <w:numId w:val="2"/>
+          <w:numId w:val="3"/>
         </w:numPr>
         <w:spacing w:after="80" w:line="360"/>
       </w:pPr>
@@ -15714,7 +16731,7 @@
         <w:pStyle w:val="ListParagraph"/>
         <w:numPr>
           <w:ilvl w:val="0"/>
-          <w:numId w:val="2"/>
+          <w:numId w:val="3"/>
         </w:numPr>
         <w:spacing w:after="80" w:line="360"/>
       </w:pPr>
@@ -15755,7 +16772,7 @@
         <w:pStyle w:val="ListParagraph"/>
         <w:numPr>
           <w:ilvl w:val="0"/>
-          <w:numId w:val="2"/>
+          <w:numId w:val="3"/>
         </w:numPr>
         <w:spacing w:after="80" w:line="360"/>
       </w:pPr>
@@ -15773,7 +16790,7 @@
         <w:pStyle w:val="ListParagraph"/>
         <w:numPr>
           <w:ilvl w:val="0"/>
-          <w:numId w:val="2"/>
+          <w:numId w:val="3"/>
         </w:numPr>
         <w:spacing w:after="80" w:line="360"/>
       </w:pPr>
@@ -15791,7 +16808,7 @@
         <w:pStyle w:val="ListParagraph"/>
         <w:numPr>
           <w:ilvl w:val="0"/>
-          <w:numId w:val="2"/>
+          <w:numId w:val="3"/>
         </w:numPr>
         <w:spacing w:after="80" w:line="360"/>
       </w:pPr>
@@ -15809,7 +16826,7 @@
         <w:pStyle w:val="ListParagraph"/>
         <w:numPr>
           <w:ilvl w:val="0"/>
-          <w:numId w:val="2"/>
+          <w:numId w:val="3"/>
         </w:numPr>
         <w:spacing w:after="80" w:line="360"/>
       </w:pPr>
@@ -17254,6 +18271,18 @@
       </w:pPr>
     </w:lvl>
   </w:abstractNum>
+  <w:abstractNum w:abstractNumId="3" w15:restartNumberingAfterBreak="0">
+    <w:multiLevelType w:val="hybridMultilevel"/>
+    <w:lvl w:ilvl="0" w15:tentative="1">
+      <w:start w:val="1"/>
+      <w:numFmt w:val="bullet"/>
+      <w:lvlText w:val="–"/>
+      <w:lvlJc w:val="left"/>
+      <w:pPr>
+        <w:ind w:left="200" w:hanging="200"/>
+      </w:pPr>
+    </w:lvl>
+  </w:abstractNum>
   <w:num w:numId="1">
     <w:abstractNumId w:val="1"/>
     <w:lvlOverride w:ilvl="0">
@@ -17261,6 +18290,12 @@
     </w:lvlOverride>
   </w:num>
   <w:num w:numId="2">
+    <w:abstractNumId w:val="3"/>
+    <w:lvlOverride w:ilvl="0">
+      <w:startOverride w:val="1"/>
+    </w:lvlOverride>
+  </w:num>
+  <w:num w:numId="3">
     <w:abstractNumId w:val="2"/>
     <w:lvlOverride w:ilvl="0">
       <w:startOverride w:val="1"/>

</xml_diff>